<commit_message>
Jet colour scale for CO2 saturation legend; keep result tabs on one line; refresh manual
Co-Authored-By: Claude Sonnet 5.5 <noreply@anthropic.com>
</commit_message>
<xml_diff>
--- a/public/manual/user-manual.docx
+++ b/public/manual/user-manual.docx
@@ -5214,7 +5214,7 @@
       <w:r>
         <w:drawing>
           <wp:inline distT="0" distB="0" distL="0" distR="0">
-            <wp:extent cx="5334000" cy="2676525"/>
+            <wp:extent cx="5334000" cy="2667000"/>
             <wp:effectExtent t="0" r="0" b="0" l="0"/>
             <wp:docPr id="9" name="figure" descr="Figure 9. Interference matrix and arrival-time table." title="Figure 9. Interference matrix and arrival-time table."/>
             <wp:cNvGraphicFramePr>
@@ -5239,7 +5239,7 @@
                   <pic:spPr bwMode="auto">
                     <a:xfrm>
                       <a:off x="0" y="0"/>
-                      <a:ext cx="5334000" cy="2676525"/>
+                      <a:ext cx="5334000" cy="2667000"/>
                     </a:xfrm>
                     <a:prstGeom prst="rect">
                       <a:avLst/>

</xml_diff>

<commit_message>
Hydraulic diffusivity shown as a calculated read-only value with its own unit selector
Co-Authored-By: Claude Sonnet 5.5 <noreply@anthropic.com>
</commit_message>
<xml_diff>
--- a/public/manual/user-manual.docx
+++ b/public/manual/user-manual.docx
@@ -1317,7 +1317,7 @@
       <w:r>
         <w:drawing>
           <wp:inline distT="0" distB="0" distL="0" distR="0">
-            <wp:extent cx="5314950" cy="4000500"/>
+            <wp:extent cx="4829175" cy="4000500"/>
             <wp:effectExtent t="0" r="0" b="0" l="0"/>
             <wp:docPr id="2" name="figure" descr="Figure 2. The Input section with a unit selector beside every value." title="Figure 2. The Input section with a unit selector beside every value."/>
             <wp:cNvGraphicFramePr>
@@ -1342,7 +1342,7 @@
                   <pic:spPr bwMode="auto">
                     <a:xfrm>
                       <a:off x="0" y="0"/>
-                      <a:ext cx="5314950" cy="4000500"/>
+                      <a:ext cx="4829175" cy="4000500"/>
                     </a:xfrm>
                     <a:prstGeom prst="rect">
                       <a:avLst/>
@@ -2299,6 +2299,104 @@
                 <w:szCs w:val="18"/>
               </w:rPr>
               <w:t xml:space="preserve">800 to 4000 m</w:t>
+            </w:r>
+          </w:p>
+        </w:tc>
+      </w:tr>
+      <w:tr>
+        <w:trPr>
+          <w:cantSplit/>
+        </w:trPr>
+        <w:tc>
+          <w:tcPr>
+            <w:tcBorders>
+              <w:top w:val="none" w:color="FFFFFF" w:sz="0"/>
+              <w:left w:val="none" w:color="FFFFFF" w:sz="0"/>
+              <w:bottom w:val="none" w:color="FFFFFF" w:sz="0"/>
+              <w:right w:val="none" w:color="FFFFFF" w:sz="0"/>
+            </w:tcBorders>
+            <w:tcMar>
+              <w:top w:type="dxa" w:w="40"/>
+              <w:left w:type="dxa" w:w="70"/>
+              <w:bottom w:type="dxa" w:w="40"/>
+              <w:right w:type="dxa" w:w="70"/>
+            </w:tcMar>
+          </w:tcPr>
+          <w:p>
+            <w:pPr>
+              <w:jc w:val="left"/>
+            </w:pPr>
+            <w:r>
+              <w:rPr>
+                <w:rFonts w:ascii="Times New Roman" w:cs="Times New Roman" w:eastAsia="Times New Roman" w:hAnsi="Times New Roman"/>
+                <w:b w:val="false"/>
+                <w:bCs w:val="false"/>
+                <w:sz w:val="18"/>
+                <w:szCs w:val="18"/>
+              </w:rPr>
+              <w:t xml:space="preserve">Hydraulic diffusivity (calculated)</w:t>
+            </w:r>
+          </w:p>
+        </w:tc>
+        <w:tc>
+          <w:tcPr>
+            <w:tcBorders>
+              <w:top w:val="none" w:color="FFFFFF" w:sz="0"/>
+              <w:left w:val="none" w:color="FFFFFF" w:sz="0"/>
+              <w:bottom w:val="none" w:color="FFFFFF" w:sz="0"/>
+              <w:right w:val="none" w:color="FFFFFF" w:sz="0"/>
+            </w:tcBorders>
+            <w:tcMar>
+              <w:top w:type="dxa" w:w="40"/>
+              <w:left w:type="dxa" w:w="70"/>
+              <w:bottom w:type="dxa" w:w="40"/>
+              <w:right w:type="dxa" w:w="70"/>
+            </w:tcMar>
+          </w:tcPr>
+          <w:p>
+            <w:pPr>
+              <w:jc w:val="left"/>
+            </w:pPr>
+            <w:r>
+              <w:rPr>
+                <w:rFonts w:ascii="Times New Roman" w:cs="Times New Roman" w:eastAsia="Times New Roman" w:hAnsi="Times New Roman"/>
+                <w:b w:val="false"/>
+                <w:bCs w:val="false"/>
+                <w:sz w:val="18"/>
+                <w:szCs w:val="18"/>
+              </w:rPr>
+              <w:t xml:space="preserve">Shown read-only under the inputs and calculated as k / (φ μ ct); it updates as soon as you change permeability, porosity, viscosity or compressibility. Only its display unit can be chosen.</w:t>
+            </w:r>
+          </w:p>
+        </w:tc>
+        <w:tc>
+          <w:tcPr>
+            <w:tcBorders>
+              <w:top w:val="none" w:color="FFFFFF" w:sz="0"/>
+              <w:left w:val="none" w:color="FFFFFF" w:sz="0"/>
+              <w:bottom w:val="none" w:color="FFFFFF" w:sz="0"/>
+              <w:right w:val="none" w:color="FFFFFF" w:sz="0"/>
+            </w:tcBorders>
+            <w:tcMar>
+              <w:top w:type="dxa" w:w="40"/>
+              <w:left w:type="dxa" w:w="70"/>
+              <w:bottom w:type="dxa" w:w="40"/>
+              <w:right w:type="dxa" w:w="70"/>
+            </w:tcMar>
+          </w:tcPr>
+          <w:p>
+            <w:pPr>
+              <w:jc w:val="left"/>
+            </w:pPr>
+            <w:r>
+              <w:rPr>
+                <w:rFonts w:ascii="Times New Roman" w:cs="Times New Roman" w:eastAsia="Times New Roman" w:hAnsi="Times New Roman"/>
+                <w:b w:val="false"/>
+                <w:bCs w:val="false"/>
+                <w:sz w:val="18"/>
+                <w:szCs w:val="18"/>
+              </w:rPr>
+              <w:t xml:space="preserve">0.1 to 10 m²/s</w:t>
             </w:r>
           </w:p>
         </w:tc>
@@ -3929,7 +4027,7 @@
       <w:r>
         <w:drawing>
           <wp:inline distT="0" distB="0" distL="0" distR="0">
-            <wp:extent cx="5019675" cy="4000500"/>
+            <wp:extent cx="5038725" cy="4000500"/>
             <wp:effectExtent t="0" r="0" b="0" l="0"/>
             <wp:docPr id="4" name="figure" descr="Figure 4. The Injection wells section." title="Figure 4. The Injection wells section."/>
             <wp:cNvGraphicFramePr>
@@ -3954,7 +4052,7 @@
                   <pic:spPr bwMode="auto">
                     <a:xfrm>
                       <a:off x="0" y="0"/>
-                      <a:ext cx="5019675" cy="4000500"/>
+                      <a:ext cx="5038725" cy="4000500"/>
                     </a:xfrm>
                     <a:prstGeom prst="rect">
                       <a:avLst/>
@@ -4639,7 +4737,7 @@
       <w:r>
         <w:drawing>
           <wp:inline distT="0" distB="0" distL="0" distR="0">
-            <wp:extent cx="4400550" cy="4000500"/>
+            <wp:extent cx="4410075" cy="4000500"/>
             <wp:effectExtent t="0" r="0" b="0" l="0"/>
             <wp:docPr id="5" name="figure" descr="Figure 5. The wells table in longitude / latitude mode." title="Figure 5. The wells table in longitude / latitude mode."/>
             <wp:cNvGraphicFramePr>
@@ -4664,7 +4762,7 @@
                   <pic:spPr bwMode="auto">
                     <a:xfrm>
                       <a:off x="0" y="0"/>
-                      <a:ext cx="4400550" cy="4000500"/>
+                      <a:ext cx="4410075" cy="4000500"/>
                     </a:xfrm>
                     <a:prstGeom prst="rect">
                       <a:avLst/>

</xml_diff>

<commit_message>
Rename wells anywhere (updates instantly); remove well dot on saturation map
Co-Authored-By: Claude Sonnet 5.5 <noreply@anthropic.com>
</commit_message>
<xml_diff>
--- a/public/manual/user-manual.docx
+++ b/public/manual/user-manual.docx
@@ -4242,7 +4242,7 @@
                 <w:sz w:val="18"/>
                 <w:szCs w:val="18"/>
               </w:rPr>
-              <w:t xml:space="preserve">Label shown on charts and tables.</w:t>
+              <w:t xml:space="preserve">Label shown on charts, tables and reports. Type any name you like; it updates everywhere at once, without a new RUN. You can also rename a well directly in the plume table on the CO₂ saturation tab.</w:t>
             </w:r>
           </w:p>
         </w:tc>
@@ -5019,7 +5019,7 @@
       <w:r>
         <w:drawing>
           <wp:inline distT="0" distB="0" distL="0" distR="0">
-            <wp:extent cx="4000500" cy="4000500"/>
+            <wp:extent cx="3800475" cy="4000500"/>
             <wp:effectExtent t="0" r="0" b="0" l="0"/>
             <wp:docPr id="6" name="figure" descr="Figure 6. CO₂ saturation map with the plume of each injector and the table of plume radii." title="Figure 6. CO₂ saturation map with the plume of each injector and the table of plume radii."/>
             <wp:cNvGraphicFramePr>
@@ -5044,7 +5044,7 @@
                   <pic:spPr bwMode="auto">
                     <a:xfrm>
                       <a:off x="0" y="0"/>
-                      <a:ext cx="4000500" cy="4000500"/>
+                      <a:ext cx="3800475" cy="4000500"/>
                     </a:xfrm>
                     <a:prstGeom prst="rect">
                       <a:avLst/>
@@ -5083,7 +5083,7 @@
           <w:sz w:val="22"/>
           <w:szCs w:val="22"/>
         </w:rPr>
-        <w:t xml:space="preserve">The map shows the saturation of injected CO₂ (Sg) at the evaluation time, with a labelled colour scale from 0 up to the maximum saturation. Each injector creates a roughly circular plume, shown with a black dot at the well and its name beside the plume; the plume edge is where the colour returns to the dark-blue brine background. Plumes of neighbouring wells are added where they overlap. Below the map, a table lists for each well the mass injected so far, the plume radius, the saturation just behind the front and the maximum saturation at the well. Drag the Evaluation time slider to watch the plumes grow; each plume stops growing when its well is shut in.</w:t>
+        <w:t xml:space="preserve">The map shows the saturation of injected CO₂ (Sg) at the evaluation time, with a labelled colour scale from 0 up to the maximum saturation. Each injector creates a roughly circular plume; the well is identified by its name, placed beside the plume (click a name in the table below the map to rename it); the plume edge is where the colour returns to the dark-blue brine background. Plumes of neighbouring wells are added where they overlap. Below the map, a table lists for each well the mass injected so far, the plume radius, the saturation just behind the front and the maximum saturation at the well. Drag the Evaluation time slider to watch the plumes grow; each plume stops growing when its well is shut in.</w:t>
       </w:r>
     </w:p>
     <w:p>

</xml_diff>

<commit_message>
Variable-rate schedules per well, dry-zone radius, closed-form front checks and derivation validation tests
Co-Authored-By: Claude Sonnet 5.5 <noreply@anthropic.com>
</commit_message>
<xml_diff>
--- a/public/manual/user-manual.docx
+++ b/public/manual/user-manual.docx
@@ -3630,6 +3630,398 @@
             <w:tcBorders>
               <w:top w:val="none" w:color="FFFFFF" w:sz="0"/>
               <w:left w:val="none" w:color="FFFFFF" w:sz="0"/>
+              <w:bottom w:val="none" w:color="FFFFFF" w:sz="0"/>
+              <w:right w:val="none" w:color="FFFFFF" w:sz="0"/>
+            </w:tcBorders>
+            <w:tcMar>
+              <w:top w:type="dxa" w:w="40"/>
+              <w:left w:type="dxa" w:w="70"/>
+              <w:bottom w:type="dxa" w:w="40"/>
+              <w:right w:type="dxa" w:w="70"/>
+            </w:tcMar>
+          </w:tcPr>
+          <w:p>
+            <w:pPr>
+              <w:jc w:val="left"/>
+            </w:pPr>
+            <w:r>
+              <w:rPr>
+                <w:rFonts w:ascii="Times New Roman" w:cs="Times New Roman" w:eastAsia="Times New Roman" w:hAnsi="Times New Roman"/>
+                <w:b w:val="false"/>
+                <w:bCs w:val="false"/>
+                <w:sz w:val="18"/>
+                <w:szCs w:val="18"/>
+              </w:rPr>
+              <w:t xml:space="preserve">CO₂ viscosity</w:t>
+            </w:r>
+          </w:p>
+        </w:tc>
+        <w:tc>
+          <w:tcPr>
+            <w:tcBorders>
+              <w:top w:val="none" w:color="FFFFFF" w:sz="0"/>
+              <w:left w:val="none" w:color="FFFFFF" w:sz="0"/>
+              <w:bottom w:val="none" w:color="FFFFFF" w:sz="0"/>
+              <w:right w:val="none" w:color="FFFFFF" w:sz="0"/>
+            </w:tcBorders>
+            <w:tcMar>
+              <w:top w:type="dxa" w:w="40"/>
+              <w:left w:type="dxa" w:w="70"/>
+              <w:bottom w:type="dxa" w:w="40"/>
+              <w:right w:type="dxa" w:w="70"/>
+            </w:tcMar>
+          </w:tcPr>
+          <w:p>
+            <w:pPr>
+              <w:jc w:val="left"/>
+            </w:pPr>
+            <w:r>
+              <w:rPr>
+                <w:rFonts w:ascii="Times New Roman" w:cs="Times New Roman" w:eastAsia="Times New Roman" w:hAnsi="Times New Roman"/>
+                <w:b w:val="false"/>
+                <w:bCs w:val="false"/>
+                <w:sz w:val="18"/>
+                <w:szCs w:val="18"/>
+              </w:rPr>
+              <w:t xml:space="preserve">Viscosity of CO₂ at reservoir conditions.</w:t>
+            </w:r>
+          </w:p>
+        </w:tc>
+        <w:tc>
+          <w:tcPr>
+            <w:tcBorders>
+              <w:top w:val="none" w:color="FFFFFF" w:sz="0"/>
+              <w:left w:val="none" w:color="FFFFFF" w:sz="0"/>
+              <w:bottom w:val="none" w:color="FFFFFF" w:sz="0"/>
+              <w:right w:val="none" w:color="FFFFFF" w:sz="0"/>
+            </w:tcBorders>
+            <w:tcMar>
+              <w:top w:type="dxa" w:w="40"/>
+              <w:left w:type="dxa" w:w="70"/>
+              <w:bottom w:type="dxa" w:w="40"/>
+              <w:right w:type="dxa" w:w="70"/>
+            </w:tcMar>
+          </w:tcPr>
+          <w:p>
+            <w:pPr>
+              <w:jc w:val="left"/>
+            </w:pPr>
+            <w:r>
+              <w:rPr>
+                <w:rFonts w:ascii="Times New Roman" w:cs="Times New Roman" w:eastAsia="Times New Roman" w:hAnsi="Times New Roman"/>
+                <w:b w:val="false"/>
+                <w:bCs w:val="false"/>
+                <w:sz w:val="18"/>
+                <w:szCs w:val="18"/>
+              </w:rPr>
+              <w:t xml:space="preserve">0.06 mPa·s</w:t>
+            </w:r>
+          </w:p>
+        </w:tc>
+      </w:tr>
+      <w:tr>
+        <w:trPr>
+          <w:cantSplit/>
+        </w:trPr>
+        <w:tc>
+          <w:tcPr>
+            <w:tcBorders>
+              <w:top w:val="none" w:color="FFFFFF" w:sz="0"/>
+              <w:left w:val="none" w:color="FFFFFF" w:sz="0"/>
+              <w:bottom w:val="none" w:color="FFFFFF" w:sz="0"/>
+              <w:right w:val="none" w:color="FFFFFF" w:sz="0"/>
+            </w:tcBorders>
+            <w:tcMar>
+              <w:top w:type="dxa" w:w="40"/>
+              <w:left w:type="dxa" w:w="70"/>
+              <w:bottom w:type="dxa" w:w="40"/>
+              <w:right w:type="dxa" w:w="70"/>
+            </w:tcMar>
+          </w:tcPr>
+          <w:p>
+            <w:pPr>
+              <w:jc w:val="left"/>
+            </w:pPr>
+            <w:r>
+              <w:rPr>
+                <w:rFonts w:ascii="Times New Roman" w:cs="Times New Roman" w:eastAsia="Times New Roman" w:hAnsi="Times New Roman"/>
+                <w:b w:val="false"/>
+                <w:bCs w:val="false"/>
+                <w:sz w:val="18"/>
+                <w:szCs w:val="18"/>
+              </w:rPr>
+              <w:t xml:space="preserve">Reservoir temperature</w:t>
+            </w:r>
+          </w:p>
+        </w:tc>
+        <w:tc>
+          <w:tcPr>
+            <w:tcBorders>
+              <w:top w:val="none" w:color="FFFFFF" w:sz="0"/>
+              <w:left w:val="none" w:color="FFFFFF" w:sz="0"/>
+              <w:bottom w:val="none" w:color="FFFFFF" w:sz="0"/>
+              <w:right w:val="none" w:color="FFFFFF" w:sz="0"/>
+            </w:tcBorders>
+            <w:tcMar>
+              <w:top w:type="dxa" w:w="40"/>
+              <w:left w:type="dxa" w:w="70"/>
+              <w:bottom w:type="dxa" w:w="40"/>
+              <w:right w:type="dxa" w:w="70"/>
+            </w:tcMar>
+          </w:tcPr>
+          <w:p>
+            <w:pPr>
+              <w:jc w:val="left"/>
+            </w:pPr>
+            <w:r>
+              <w:rPr>
+                <w:rFonts w:ascii="Times New Roman" w:cs="Times New Roman" w:eastAsia="Times New Roman" w:hAnsi="Times New Roman"/>
+                <w:b w:val="false"/>
+                <w:bCs w:val="false"/>
+                <w:sz w:val="18"/>
+                <w:szCs w:val="18"/>
+              </w:rPr>
+              <w:t xml:space="preserve">Used for the dry-zone calculation (water content of CO₂).</w:t>
+            </w:r>
+          </w:p>
+        </w:tc>
+        <w:tc>
+          <w:tcPr>
+            <w:tcBorders>
+              <w:top w:val="none" w:color="FFFFFF" w:sz="0"/>
+              <w:left w:val="none" w:color="FFFFFF" w:sz="0"/>
+              <w:bottom w:val="none" w:color="FFFFFF" w:sz="0"/>
+              <w:right w:val="none" w:color="FFFFFF" w:sz="0"/>
+            </w:tcBorders>
+            <w:tcMar>
+              <w:top w:type="dxa" w:w="40"/>
+              <w:left w:type="dxa" w:w="70"/>
+              <w:bottom w:type="dxa" w:w="40"/>
+              <w:right w:type="dxa" w:w="70"/>
+            </w:tcMar>
+          </w:tcPr>
+          <w:p>
+            <w:pPr>
+              <w:jc w:val="left"/>
+            </w:pPr>
+            <w:r>
+              <w:rPr>
+                <w:rFonts w:ascii="Times New Roman" w:cs="Times New Roman" w:eastAsia="Times New Roman" w:hAnsi="Times New Roman"/>
+                <w:b w:val="false"/>
+                <w:bCs w:val="false"/>
+                <w:sz w:val="18"/>
+                <w:szCs w:val="18"/>
+              </w:rPr>
+              <w:t xml:space="preserve">40 to 120 °C</w:t>
+            </w:r>
+          </w:p>
+        </w:tc>
+      </w:tr>
+      <w:tr>
+        <w:trPr>
+          <w:cantSplit/>
+        </w:trPr>
+        <w:tc>
+          <w:tcPr>
+            <w:tcBorders>
+              <w:top w:val="none" w:color="FFFFFF" w:sz="0"/>
+              <w:left w:val="none" w:color="FFFFFF" w:sz="0"/>
+              <w:bottom w:val="none" w:color="FFFFFF" w:sz="0"/>
+              <w:right w:val="none" w:color="FFFFFF" w:sz="0"/>
+            </w:tcBorders>
+            <w:tcMar>
+              <w:top w:type="dxa" w:w="40"/>
+              <w:left w:type="dxa" w:w="70"/>
+              <w:bottom w:type="dxa" w:w="40"/>
+              <w:right w:type="dxa" w:w="70"/>
+            </w:tcMar>
+          </w:tcPr>
+          <w:p>
+            <w:pPr>
+              <w:jc w:val="left"/>
+            </w:pPr>
+            <w:r>
+              <w:rPr>
+                <w:rFonts w:ascii="Times New Roman" w:cs="Times New Roman" w:eastAsia="Times New Roman" w:hAnsi="Times New Roman"/>
+                <w:b w:val="false"/>
+                <w:bCs w:val="false"/>
+                <w:sz w:val="18"/>
+                <w:szCs w:val="18"/>
+              </w:rPr>
+              <w:t xml:space="preserve">Brine salinity (NaCl)</w:t>
+            </w:r>
+          </w:p>
+        </w:tc>
+        <w:tc>
+          <w:tcPr>
+            <w:tcBorders>
+              <w:top w:val="none" w:color="FFFFFF" w:sz="0"/>
+              <w:left w:val="none" w:color="FFFFFF" w:sz="0"/>
+              <w:bottom w:val="none" w:color="FFFFFF" w:sz="0"/>
+              <w:right w:val="none" w:color="FFFFFF" w:sz="0"/>
+            </w:tcBorders>
+            <w:tcMar>
+              <w:top w:type="dxa" w:w="40"/>
+              <w:left w:type="dxa" w:w="70"/>
+              <w:bottom w:type="dxa" w:w="40"/>
+              <w:right w:type="dxa" w:w="70"/>
+            </w:tcMar>
+          </w:tcPr>
+          <w:p>
+            <w:pPr>
+              <w:jc w:val="left"/>
+            </w:pPr>
+            <w:r>
+              <w:rPr>
+                <w:rFonts w:ascii="Times New Roman" w:cs="Times New Roman" w:eastAsia="Times New Roman" w:hAnsi="Times New Roman"/>
+                <w:b w:val="false"/>
+                <w:bCs w:val="false"/>
+                <w:sz w:val="18"/>
+                <w:szCs w:val="18"/>
+              </w:rPr>
+              <w:t xml:space="preserve">NaCl mass fraction of the brine; lowers the water activity.</w:t>
+            </w:r>
+          </w:p>
+        </w:tc>
+        <w:tc>
+          <w:tcPr>
+            <w:tcBorders>
+              <w:top w:val="none" w:color="FFFFFF" w:sz="0"/>
+              <w:left w:val="none" w:color="FFFFFF" w:sz="0"/>
+              <w:bottom w:val="none" w:color="FFFFFF" w:sz="0"/>
+              <w:right w:val="none" w:color="FFFFFF" w:sz="0"/>
+            </w:tcBorders>
+            <w:tcMar>
+              <w:top w:type="dxa" w:w="40"/>
+              <w:left w:type="dxa" w:w="70"/>
+              <w:bottom w:type="dxa" w:w="40"/>
+              <w:right w:type="dxa" w:w="70"/>
+            </w:tcMar>
+          </w:tcPr>
+          <w:p>
+            <w:pPr>
+              <w:jc w:val="left"/>
+            </w:pPr>
+            <w:r>
+              <w:rPr>
+                <w:rFonts w:ascii="Times New Roman" w:cs="Times New Roman" w:eastAsia="Times New Roman" w:hAnsi="Times New Roman"/>
+                <w:b w:val="false"/>
+                <w:bCs w:val="false"/>
+                <w:sz w:val="18"/>
+                <w:szCs w:val="18"/>
+              </w:rPr>
+              <w:t xml:space="preserve">0 to 0.26</w:t>
+            </w:r>
+          </w:p>
+        </w:tc>
+      </w:tr>
+      <w:tr>
+        <w:trPr>
+          <w:cantSplit/>
+        </w:trPr>
+        <w:tc>
+          <w:tcPr>
+            <w:tcBorders>
+              <w:top w:val="none" w:color="FFFFFF" w:sz="0"/>
+              <w:left w:val="none" w:color="FFFFFF" w:sz="0"/>
+              <w:bottom w:val="none" w:color="FFFFFF" w:sz="0"/>
+              <w:right w:val="none" w:color="FFFFFF" w:sz="0"/>
+            </w:tcBorders>
+            <w:tcMar>
+              <w:top w:type="dxa" w:w="40"/>
+              <w:left w:type="dxa" w:w="70"/>
+              <w:bottom w:type="dxa" w:w="40"/>
+              <w:right w:type="dxa" w:w="70"/>
+            </w:tcMar>
+          </w:tcPr>
+          <w:p>
+            <w:pPr>
+              <w:jc w:val="left"/>
+            </w:pPr>
+            <w:r>
+              <w:rPr>
+                <w:rFonts w:ascii="Times New Roman" w:cs="Times New Roman" w:eastAsia="Times New Roman" w:hAnsi="Times New Roman"/>
+                <w:b w:val="false"/>
+                <w:bCs w:val="false"/>
+                <w:sz w:val="18"/>
+                <w:szCs w:val="18"/>
+              </w:rPr>
+              <w:t xml:space="preserve">Brine density</w:t>
+            </w:r>
+          </w:p>
+        </w:tc>
+        <w:tc>
+          <w:tcPr>
+            <w:tcBorders>
+              <w:top w:val="none" w:color="FFFFFF" w:sz="0"/>
+              <w:left w:val="none" w:color="FFFFFF" w:sz="0"/>
+              <w:bottom w:val="none" w:color="FFFFFF" w:sz="0"/>
+              <w:right w:val="none" w:color="FFFFFF" w:sz="0"/>
+            </w:tcBorders>
+            <w:tcMar>
+              <w:top w:type="dxa" w:w="40"/>
+              <w:left w:type="dxa" w:w="70"/>
+              <w:bottom w:type="dxa" w:w="40"/>
+              <w:right w:type="dxa" w:w="70"/>
+            </w:tcMar>
+          </w:tcPr>
+          <w:p>
+            <w:pPr>
+              <w:jc w:val="left"/>
+            </w:pPr>
+            <w:r>
+              <w:rPr>
+                <w:rFonts w:ascii="Times New Roman" w:cs="Times New Roman" w:eastAsia="Times New Roman" w:hAnsi="Times New Roman"/>
+                <w:b w:val="false"/>
+                <w:bCs w:val="false"/>
+                <w:sz w:val="18"/>
+                <w:szCs w:val="18"/>
+              </w:rPr>
+              <w:t xml:space="preserve">Density of the formation brine at reservoir conditions.</w:t>
+            </w:r>
+          </w:p>
+        </w:tc>
+        <w:tc>
+          <w:tcPr>
+            <w:tcBorders>
+              <w:top w:val="none" w:color="FFFFFF" w:sz="0"/>
+              <w:left w:val="none" w:color="FFFFFF" w:sz="0"/>
+              <w:bottom w:val="none" w:color="FFFFFF" w:sz="0"/>
+              <w:right w:val="none" w:color="FFFFFF" w:sz="0"/>
+            </w:tcBorders>
+            <w:tcMar>
+              <w:top w:type="dxa" w:w="40"/>
+              <w:left w:type="dxa" w:w="70"/>
+              <w:bottom w:type="dxa" w:w="40"/>
+              <w:right w:type="dxa" w:w="70"/>
+            </w:tcMar>
+          </w:tcPr>
+          <w:p>
+            <w:pPr>
+              <w:jc w:val="left"/>
+            </w:pPr>
+            <w:r>
+              <w:rPr>
+                <w:rFonts w:ascii="Times New Roman" w:cs="Times New Roman" w:eastAsia="Times New Roman" w:hAnsi="Times New Roman"/>
+                <w:b w:val="false"/>
+                <w:bCs w:val="false"/>
+                <w:sz w:val="18"/>
+                <w:szCs w:val="18"/>
+              </w:rPr>
+              <w:t xml:space="preserve">1000 to 1200 kg/m³</w:t>
+            </w:r>
+          </w:p>
+        </w:tc>
+      </w:tr>
+      <w:tr>
+        <w:trPr>
+          <w:cantSplit/>
+        </w:trPr>
+        <w:tc>
+          <w:tcPr>
+            <w:tcBorders>
+              <w:top w:val="none" w:color="FFFFFF" w:sz="0"/>
+              <w:left w:val="none" w:color="FFFFFF" w:sz="0"/>
               <w:bottom w:val="single" w:color="111111" w:sz="8"/>
               <w:right w:val="none" w:color="FFFFFF" w:sz="0"/>
             </w:tcBorders>
@@ -3652,7 +4044,7 @@
                 <w:sz w:val="18"/>
                 <w:szCs w:val="18"/>
               </w:rPr>
-              <w:t xml:space="preserve">CO₂ viscosity</w:t>
+              <w:t xml:space="preserve">Water fugacity coeff. Φw</w:t>
             </w:r>
           </w:p>
         </w:tc>
@@ -3683,7 +4075,7 @@
                 <w:sz w:val="18"/>
                 <w:szCs w:val="18"/>
               </w:rPr>
-              <w:t xml:space="preserve">Viscosity of CO₂ at reservoir conditions.</w:t>
+              <w:t xml:space="preserve">Fugacity coefficient of water in the CO₂-rich phase. 1 is the screening approximation; smaller values mean the CO₂ carries more water and the dry zone is larger.</w:t>
             </w:r>
           </w:p>
         </w:tc>
@@ -3714,7 +4106,7 @@
                 <w:sz w:val="18"/>
                 <w:szCs w:val="18"/>
               </w:rPr>
-              <w:t xml:space="preserve">0.06 mPa·s</w:t>
+              <w:t xml:space="preserve">0.2 to 1</w:t>
             </w:r>
           </w:p>
         </w:tc>
@@ -3732,7 +4124,7 @@
           <w:sz w:val="17"/>
           <w:szCs w:val="17"/>
         </w:rPr>
-        <w:t xml:space="preserve">The defaults are illustrative; replace them with values for your formation (for example from core measurements).</w:t>
+        <w:t xml:space="preserve">The defaults are illustrative; replace them with values for your formation (for example from core measurements and fluid properties).</w:t>
       </w:r>
     </w:p>
     <w:p>
@@ -4027,7 +4419,7 @@
       <w:r>
         <w:drawing>
           <wp:inline distT="0" distB="0" distL="0" distR="0">
-            <wp:extent cx="5038725" cy="4000500"/>
+            <wp:extent cx="4591050" cy="4000500"/>
             <wp:effectExtent t="0" r="0" b="0" l="0"/>
             <wp:docPr id="4" name="figure" descr="Figure 4. The Injection wells section." title="Figure 4. The Injection wells section."/>
             <wp:cNvGraphicFramePr>
@@ -4052,7 +4444,7 @@
                   <pic:spPr bwMode="auto">
                     <a:xfrm>
                       <a:off x="0" y="0"/>
-                      <a:ext cx="5038725" cy="4000500"/>
+                      <a:ext cx="4591050" cy="4000500"/>
                     </a:xfrm>
                     <a:prstGeom prst="rect">
                       <a:avLst/>
@@ -4376,7 +4768,7 @@
                 <w:sz w:val="18"/>
                 <w:szCs w:val="18"/>
               </w:rPr>
-              <w:t xml:space="preserve">CO₂ injection rate (default unit Mt/yr). Change the unit in the column header.</w:t>
+              <w:t xml:space="preserve">CO₂ injection rate of the first period (default unit Mt/yr). Change the unit in the column header.</w:t>
             </w:r>
           </w:p>
         </w:tc>
@@ -4524,6 +4916,73 @@
             <w:tcBorders>
               <w:top w:val="none" w:color="FFFFFF" w:sz="0"/>
               <w:left w:val="none" w:color="FFFFFF" w:sz="0"/>
+              <w:bottom w:val="none" w:color="FFFFFF" w:sz="0"/>
+              <w:right w:val="none" w:color="FFFFFF" w:sz="0"/>
+            </w:tcBorders>
+            <w:tcMar>
+              <w:top w:type="dxa" w:w="40"/>
+              <w:left w:type="dxa" w:w="70"/>
+              <w:bottom w:type="dxa" w:w="40"/>
+              <w:right w:type="dxa" w:w="70"/>
+            </w:tcMar>
+          </w:tcPr>
+          <w:p>
+            <w:pPr>
+              <w:jc w:val="left"/>
+            </w:pPr>
+            <w:r>
+              <w:rPr>
+                <w:rFonts w:ascii="Times New Roman" w:cs="Times New Roman" w:eastAsia="Times New Roman" w:hAnsi="Times New Roman"/>
+                <w:b w:val="false"/>
+                <w:bCs w:val="false"/>
+                <w:sz w:val="18"/>
+                <w:szCs w:val="18"/>
+              </w:rPr>
+              <w:t xml:space="preserve">＋</w:t>
+            </w:r>
+          </w:p>
+        </w:tc>
+        <w:tc>
+          <w:tcPr>
+            <w:tcBorders>
+              <w:top w:val="none" w:color="FFFFFF" w:sz="0"/>
+              <w:left w:val="none" w:color="FFFFFF" w:sz="0"/>
+              <w:bottom w:val="none" w:color="FFFFFF" w:sz="0"/>
+              <w:right w:val="none" w:color="FFFFFF" w:sz="0"/>
+            </w:tcBorders>
+            <w:tcMar>
+              <w:top w:type="dxa" w:w="40"/>
+              <w:left w:type="dxa" w:w="70"/>
+              <w:bottom w:type="dxa" w:w="40"/>
+              <w:right w:type="dxa" w:w="70"/>
+            </w:tcMar>
+          </w:tcPr>
+          <w:p>
+            <w:pPr>
+              <w:jc w:val="left"/>
+            </w:pPr>
+            <w:r>
+              <w:rPr>
+                <w:rFonts w:ascii="Times New Roman" w:cs="Times New Roman" w:eastAsia="Times New Roman" w:hAnsi="Times New Roman"/>
+                <w:b w:val="false"/>
+                <w:bCs w:val="false"/>
+                <w:sz w:val="18"/>
+                <w:szCs w:val="18"/>
+              </w:rPr>
+              <w:t xml:space="preserve">Adds a rate change to the well (Section 4.7.1).</w:t>
+            </w:r>
+          </w:p>
+        </w:tc>
+      </w:tr>
+      <w:tr>
+        <w:trPr>
+          <w:cantSplit/>
+        </w:trPr>
+        <w:tc>
+          <w:tcPr>
+            <w:tcBorders>
+              <w:top w:val="none" w:color="FFFFFF" w:sz="0"/>
+              <w:left w:val="none" w:color="FFFFFF" w:sz="0"/>
               <w:bottom w:val="single" w:color="111111" w:sz="8"/>
               <w:right w:val="none" w:color="FFFFFF" w:sz="0"/>
             </w:tcBorders>
@@ -4600,6 +5059,37 @@
           <w:szCs w:val="22"/>
         </w:rPr>
         <w:t xml:space="preserve">Use + Add well to add a well. Import CSV loads a table of wells from a file and Export saves the current table (Section 9).</w:t>
+      </w:r>
+    </w:p>
+    <w:p>
+      <w:pPr>
+        <w:pStyle w:val="Heading2"/>
+        <w:keepNext/>
+        <w:spacing w:after="60" w:before="160"/>
+      </w:pPr>
+      <w:r>
+        <w:rPr>
+          <w:rFonts w:ascii="Times New Roman" w:cs="Times New Roman" w:eastAsia="Times New Roman" w:hAnsi="Times New Roman"/>
+          <w:b/>
+          <w:bCs/>
+          <w:sz w:val="22"/>
+          <w:szCs w:val="22"/>
+        </w:rPr>
+        <w:t xml:space="preserve">4.7.1 Rate changes (variable injection rate)</w:t>
+      </w:r>
+    </w:p>
+    <w:p>
+      <w:pPr>
+        <w:spacing w:after="120" w:line="276"/>
+        <w:jc w:val="both"/>
+      </w:pPr>
+      <w:r>
+        <w:rPr>
+          <w:rFonts w:ascii="Times New Roman" w:cs="Times New Roman" w:eastAsia="Times New Roman" w:hAnsi="Times New Roman"/>
+          <w:sz w:val="22"/>
+          <w:szCs w:val="22"/>
+        </w:rPr>
+        <w:t xml:space="preserve">A well can inject at more than one rate. Click ＋ at the end of a well's row to add a rate change: a new row appears below the well with the year from which the new rate applies and the new rate. Add as many changes as you need. Each rate stays in force until the next change, the last rate stays in force until the End year, and the well is then shut in. The pressure effect of every change is added by superposition in time, so a rate reduction partly offsets the earlier buildup and the pressure recovers after shut-in. Skin acts on the rate in force, and the CO₂ plume depends on the total volume injected so far.</w:t>
       </w:r>
     </w:p>
     <w:p>
@@ -4737,7 +5227,7 @@
       <w:r>
         <w:drawing>
           <wp:inline distT="0" distB="0" distL="0" distR="0">
-            <wp:extent cx="4410075" cy="4000500"/>
+            <wp:extent cx="4067175" cy="4000500"/>
             <wp:effectExtent t="0" r="0" b="0" l="0"/>
             <wp:docPr id="5" name="figure" descr="Figure 5. The wells table in longitude / latitude mode." title="Figure 5. The wells table in longitude / latitude mode."/>
             <wp:cNvGraphicFramePr>
@@ -4762,7 +5252,7 @@
                   <pic:spPr bwMode="auto">
                     <a:xfrm>
                       <a:off x="0" y="0"/>
-                      <a:ext cx="4410075" cy="4000500"/>
+                      <a:ext cx="4067175" cy="4000500"/>
                     </a:xfrm>
                     <a:prstGeom prst="rect">
                       <a:avLst/>
@@ -5083,7 +5573,7 @@
           <w:sz w:val="22"/>
           <w:szCs w:val="22"/>
         </w:rPr>
-        <w:t xml:space="preserve">The map shows the saturation of injected CO₂ (Sg) at the evaluation time, with a labelled colour scale from 0 up to the maximum saturation. Each injector creates a roughly circular plume; the well is drawn as a thin vertical line that starts at the plume centre and points upward, with its name centred on top of the line (click a name in the table below the map to rename it); the plume edge is where the colour returns to the dark-blue brine background. Plumes of neighbouring wells are added where they overlap. Below the map, a table lists for each well the mass injected so far, the plume radius, the saturation just behind the front and the maximum saturation at the well. Drag the Evaluation time slider to watch the plumes grow; each plume stops growing when its well is shut in.</w:t>
+        <w:t xml:space="preserve">The map shows the saturation of injected CO₂ (Sg) at the evaluation time, with a labelled colour scale from 0 up to the maximum saturation. Each injector creates a roughly circular plume; the well is drawn as a thin vertical line that starts at the plume centre and points upward, with its name centred on top of the line (click a name in the table below the map to rename it); the plume edge is where the colour returns to the dark-blue brine background. Plumes of neighbouring wells are added where they overlap. Below the map, a table lists for each well the mass injected so far, the plume radius (the CO₂ front), the dry-zone radius (the evaporation front next to the well, where the brine has been dried out), the saturation just behind the front and the maximum saturation at the well. Drag the Evaluation time slider to watch the plumes grow; each plume stops growing when its well is shut in.</w:t>
       </w:r>
     </w:p>
     <w:p>
@@ -6371,7 +6861,7 @@
                 <w:sz w:val="18"/>
                 <w:szCs w:val="18"/>
               </w:rPr>
-              <w:t xml:space="preserve">name, x_m, y_m, rate_Mtpa, start_yr, end_yr, skin (optional)</w:t>
+              <w:t xml:space="preserve">name, x_m, y_m, rate_Mtpa, start_yr, end_yr, skin (optional), changes (optional)</w:t>
             </w:r>
           </w:p>
         </w:tc>
@@ -6438,7 +6928,7 @@
                 <w:sz w:val="18"/>
                 <w:szCs w:val="18"/>
               </w:rPr>
-              <w:t xml:space="preserve">name, lon_deg, lat_deg, rate_Mtpa, start_yr, end_yr, skin (optional)</w:t>
+              <w:t xml:space="preserve">name, lon_deg, lat_deg, rate_Mtpa, start_yr, end_yr, skin (optional), changes (optional)</w:t>
             </w:r>
           </w:p>
         </w:tc>
@@ -6456,7 +6946,7 @@
           <w:sz w:val="17"/>
           <w:szCs w:val="17"/>
         </w:rPr>
-        <w:t xml:space="preserve">An empty skin means “calculate it”. A header whose second column contains “lon” switches the application to longitude / latitude mode on import.</w:t>
+        <w:t xml:space="preserve">An empty skin means “calculate it”. The optional changes column lists rate changes as year:rate pairs separated by | , for example 8:0.5|15:0.2 (the rate becomes 0.5 Mt/yr from year 8 and 0.2 Mt/yr from year 15). A header whose second column contains “lon” switches the application to longitude / latitude mode on import.</w:t>
       </w:r>
     </w:p>
     <w:p>
@@ -6501,7 +6991,7 @@
           <w:sz w:val="22"/>
           <w:szCs w:val="22"/>
         </w:rPr>
-        <w:t xml:space="preserve">Pressure buildup is calculated from the Theis line-source solution for each well, added together in space and time, with shut-in modelled by a negative rate after the end year and a straight boundary modelled with image wells. The wellbore pressure adds the skin term. CO₂ saturation follows from the radial Buckley–Leverett (Welge) solution with Corey relative permeabilities. The report contains the equations.</w:t>
+        <w:t xml:space="preserve">Pressure buildup is calculated from the Theis line-source solution for each well, added together in space and time (one term for every rate change of every well, the shut-in being a change to zero rate), with a straight boundary modelled with image wells. The wellbore pressure adds the skin term. CO₂ saturation follows from the radial Buckley–Leverett (Welge) solution with Corey relative permeabilities. The report contains the equations.</w:t>
       </w:r>
     </w:p>
     <w:p>
@@ -6558,7 +7048,26 @@
           <w:sz w:val="22"/>
           <w:szCs w:val="22"/>
         </w:rPr>
-        <w:t xml:space="preserve">The CO₂ saturation map neglects gravity override, dissolution, capillary pressure and residual trapping, and does not feel the aquifer boundary.</w:t>
+        <w:t xml:space="preserve">The CO₂ saturation map neglects gravity override, dissolution, capillary pressure and residual trapping, and does not feel the aquifer boundary. The dry-zone radius is a screening estimate (water fugacity coefficient set by you, default 1) evaluated at the initial reservoir pressure.</w:t>
+      </w:r>
+    </w:p>
+    <w:p>
+      <w:pPr>
+        <w:pStyle w:val="ListParagraph"/>
+        <w:numPr>
+          <w:ilvl w:val="0"/>
+          <w:numId w:val="1"/>
+        </w:numPr>
+        <w:spacing w:after="50" w:line="264"/>
+        <w:jc w:val="both"/>
+      </w:pPr>
+      <w:r>
+        <w:rPr>
+          <w:rFonts w:ascii="Times New Roman" w:cs="Times New Roman" w:eastAsia="Times New Roman" w:hAnsi="Times New Roman"/>
+          <w:sz w:val="22"/>
+          <w:szCs w:val="22"/>
+        </w:rPr>
+        <w:t xml:space="preserve">The pressure calculation uses the single-phase (brine-equivalent) kernel everywhere; the different mobility and compressibility of the dry, two-phase and brine zones are not included in the pressure response.</w:t>
       </w:r>
     </w:p>
     <w:p>

</xml_diff>

<commit_message>
Three-zone CO2-brine pressure kernel (switchable), rock/CO2 compressibility inputs, wrapped PDF equations
Co-Authored-By: Claude Sonnet 5.5 <noreply@anthropic.com>
</commit_message>
<xml_diff>
--- a/public/manual/user-manual.docx
+++ b/public/manual/user-manual.docx
@@ -381,7 +381,7 @@
           <w:sz w:val="22"/>
           <w:szCs w:val="22"/>
         </w:rPr>
-        <w:t xml:space="preserve">Step 4. Read the status card: with the example data the peak buildup is about 10.05 MPa against an allowable 8.70 MPa, so it reports “Limit exceeded”.</w:t>
+        <w:t xml:space="preserve">Step 4. Read the status card: with the example data and the default three-zone pressure model the peak buildup is about 8.57 MPa against an allowable 8.70 MPa, so it reports “Within limit”. (With the single-phase option in the Pressure model section the peak is about 10.05 MPa and the status is “Limit exceeded”.)</w:t>
       </w:r>
     </w:p>
     <w:p>
@@ -2519,6 +2519,622 @@
           <w:sz w:val="22"/>
           <w:szCs w:val="22"/>
         </w:rPr>
+        <w:t xml:space="preserve">4.2.1 Pressure model</w:t>
+      </w:r>
+    </w:p>
+    <w:p>
+      <w:pPr>
+        <w:spacing w:after="120" w:line="276"/>
+        <w:jc w:val="both"/>
+      </w:pPr>
+      <w:r>
+        <w:rPr>
+          <w:rFonts w:ascii="Times New Roman" w:cs="Times New Roman" w:eastAsia="Times New Roman" w:hAnsi="Times New Roman"/>
+          <w:sz w:val="22"/>
+          <w:szCs w:val="22"/>
+        </w:rPr>
+        <w:t xml:space="preserve">The Pressure model section chooses how the pressure around each well is calculated. The default is the Three-zone CO₂–brine model, which recognises that injected CO₂ creates three regions: a dry CO₂ zone next to the well, a CO₂–brine two-phase zone and the undisturbed brine. Each region has its own mobility (how easily it flows) and diffusivity (how fast pressure spreads), and the pressure solution is matched at the two fronts. Choose Single-phase, brine-equivalent (Theis) to treat the whole aquifer as brine, as in the earlier versions of the application.</w:t>
+      </w:r>
+    </w:p>
+    <w:p>
+      <w:pPr>
+        <w:keepNext/>
+        <w:spacing w:after="60" w:before="120"/>
+      </w:pPr>
+      <w:r>
+        <w:rPr>
+          <w:rFonts w:ascii="Times New Roman" w:cs="Times New Roman" w:eastAsia="Times New Roman" w:hAnsi="Times New Roman"/>
+          <w:b/>
+          <w:bCs/>
+          <w:sz w:val="20"/>
+          <w:szCs w:val="20"/>
+        </w:rPr>
+        <w:t xml:space="preserve">Table 2a. How the three-zone model is set up.</w:t>
+      </w:r>
+    </w:p>
+    <w:tbl>
+      <w:tblPr>
+        <w:tblW w:type="pct" w:w="5000"/>
+        <w:tblBorders>
+          <w:top w:val="none" w:color="FFFFFF" w:sz="0"/>
+          <w:left w:val="none" w:color="FFFFFF" w:sz="0"/>
+          <w:bottom w:val="none" w:color="FFFFFF" w:sz="0"/>
+          <w:right w:val="none" w:color="FFFFFF" w:sz="0"/>
+          <w:insideH w:val="none" w:color="FFFFFF" w:sz="0"/>
+          <w:insideV w:val="none" w:color="FFFFFF" w:sz="0"/>
+        </w:tblBorders>
+      </w:tblPr>
+      <w:tblGrid>
+        <w:gridCol w:w="4536"/>
+        <w:gridCol w:w="4536"/>
+      </w:tblGrid>
+      <w:tr>
+        <w:trPr>
+          <w:cantSplit/>
+          <w:tblHeader/>
+        </w:trPr>
+        <w:tc>
+          <w:tcPr>
+            <w:tcBorders>
+              <w:top w:val="single" w:color="111111" w:sz="8"/>
+              <w:left w:val="none" w:color="FFFFFF" w:sz="0"/>
+              <w:bottom w:val="single" w:color="111111" w:sz="4"/>
+              <w:right w:val="none" w:color="FFFFFF" w:sz="0"/>
+            </w:tcBorders>
+            <w:tcMar>
+              <w:top w:type="dxa" w:w="40"/>
+              <w:left w:type="dxa" w:w="70"/>
+              <w:bottom w:type="dxa" w:w="40"/>
+              <w:right w:type="dxa" w:w="70"/>
+            </w:tcMar>
+          </w:tcPr>
+          <w:p>
+            <w:pPr>
+              <w:jc w:val="left"/>
+            </w:pPr>
+            <w:r>
+              <w:rPr>
+                <w:rFonts w:ascii="Times New Roman" w:cs="Times New Roman" w:eastAsia="Times New Roman" w:hAnsi="Times New Roman"/>
+                <w:b/>
+                <w:bCs/>
+                <w:sz w:val="18"/>
+                <w:szCs w:val="18"/>
+              </w:rPr>
+              <w:t xml:space="preserve">Item</w:t>
+            </w:r>
+          </w:p>
+        </w:tc>
+        <w:tc>
+          <w:tcPr>
+            <w:tcBorders>
+              <w:top w:val="single" w:color="111111" w:sz="8"/>
+              <w:left w:val="none" w:color="FFFFFF" w:sz="0"/>
+              <w:bottom w:val="single" w:color="111111" w:sz="4"/>
+              <w:right w:val="none" w:color="FFFFFF" w:sz="0"/>
+            </w:tcBorders>
+            <w:tcMar>
+              <w:top w:type="dxa" w:w="40"/>
+              <w:left w:type="dxa" w:w="70"/>
+              <w:bottom w:type="dxa" w:w="40"/>
+              <w:right w:type="dxa" w:w="70"/>
+            </w:tcMar>
+          </w:tcPr>
+          <w:p>
+            <w:pPr>
+              <w:jc w:val="left"/>
+            </w:pPr>
+            <w:r>
+              <w:rPr>
+                <w:rFonts w:ascii="Times New Roman" w:cs="Times New Roman" w:eastAsia="Times New Roman" w:hAnsi="Times New Roman"/>
+                <w:b/>
+                <w:bCs/>
+                <w:sz w:val="18"/>
+                <w:szCs w:val="18"/>
+              </w:rPr>
+              <w:t xml:space="preserve">Setting</w:t>
+            </w:r>
+          </w:p>
+        </w:tc>
+      </w:tr>
+      <w:tr>
+        <w:trPr>
+          <w:cantSplit/>
+        </w:trPr>
+        <w:tc>
+          <w:tcPr>
+            <w:tcBorders>
+              <w:top w:val="none" w:color="FFFFFF" w:sz="0"/>
+              <w:left w:val="none" w:color="FFFFFF" w:sz="0"/>
+              <w:bottom w:val="none" w:color="FFFFFF" w:sz="0"/>
+              <w:right w:val="none" w:color="FFFFFF" w:sz="0"/>
+            </w:tcBorders>
+            <w:tcMar>
+              <w:top w:type="dxa" w:w="40"/>
+              <w:left w:type="dxa" w:w="70"/>
+              <w:bottom w:type="dxa" w:w="40"/>
+              <w:right w:type="dxa" w:w="70"/>
+            </w:tcMar>
+          </w:tcPr>
+          <w:p>
+            <w:pPr>
+              <w:jc w:val="left"/>
+            </w:pPr>
+            <w:r>
+              <w:rPr>
+                <w:rFonts w:ascii="Times New Roman" w:cs="Times New Roman" w:eastAsia="Times New Roman" w:hAnsi="Times New Roman"/>
+                <w:b w:val="false"/>
+                <w:bCs w:val="false"/>
+                <w:sz w:val="18"/>
+                <w:szCs w:val="18"/>
+              </w:rPr>
+              <w:t xml:space="preserve">Reference</w:t>
+            </w:r>
+          </w:p>
+        </w:tc>
+        <w:tc>
+          <w:tcPr>
+            <w:tcBorders>
+              <w:top w:val="none" w:color="FFFFFF" w:sz="0"/>
+              <w:left w:val="none" w:color="FFFFFF" w:sz="0"/>
+              <w:bottom w:val="none" w:color="FFFFFF" w:sz="0"/>
+              <w:right w:val="none" w:color="FFFFFF" w:sz="0"/>
+            </w:tcBorders>
+            <w:tcMar>
+              <w:top w:type="dxa" w:w="40"/>
+              <w:left w:type="dxa" w:w="70"/>
+              <w:bottom w:type="dxa" w:w="40"/>
+              <w:right w:type="dxa" w:w="70"/>
+            </w:tcMar>
+          </w:tcPr>
+          <w:p>
+            <w:pPr>
+              <w:jc w:val="left"/>
+            </w:pPr>
+            <w:r>
+              <w:rPr>
+                <w:rFonts w:ascii="Times New Roman" w:cs="Times New Roman" w:eastAsia="Times New Roman" w:hAnsi="Times New Roman"/>
+                <w:b w:val="false"/>
+                <w:bCs w:val="false"/>
+                <w:sz w:val="18"/>
+                <w:szCs w:val="18"/>
+              </w:rPr>
+              <w:t xml:space="preserve">Brine: mobility k/μw and the compressibility entered above.</w:t>
+            </w:r>
+          </w:p>
+        </w:tc>
+      </w:tr>
+      <w:tr>
+        <w:trPr>
+          <w:cantSplit/>
+        </w:trPr>
+        <w:tc>
+          <w:tcPr>
+            <w:tcBorders>
+              <w:top w:val="none" w:color="FFFFFF" w:sz="0"/>
+              <w:left w:val="none" w:color="FFFFFF" w:sz="0"/>
+              <w:bottom w:val="none" w:color="FFFFFF" w:sz="0"/>
+              <w:right w:val="none" w:color="FFFFFF" w:sz="0"/>
+            </w:tcBorders>
+            <w:tcMar>
+              <w:top w:type="dxa" w:w="40"/>
+              <w:left w:type="dxa" w:w="70"/>
+              <w:bottom w:type="dxa" w:w="40"/>
+              <w:right w:type="dxa" w:w="70"/>
+            </w:tcMar>
+          </w:tcPr>
+          <w:p>
+            <w:pPr>
+              <w:jc w:val="left"/>
+            </w:pPr>
+            <w:r>
+              <w:rPr>
+                <w:rFonts w:ascii="Times New Roman" w:cs="Times New Roman" w:eastAsia="Times New Roman" w:hAnsi="Times New Roman"/>
+                <w:b w:val="false"/>
+                <w:bCs w:val="false"/>
+                <w:sz w:val="18"/>
+                <w:szCs w:val="18"/>
+              </w:rPr>
+              <w:t xml:space="preserve">Zone 1 (dry CO₂)</w:t>
+            </w:r>
+          </w:p>
+        </w:tc>
+        <w:tc>
+          <w:tcPr>
+            <w:tcBorders>
+              <w:top w:val="none" w:color="FFFFFF" w:sz="0"/>
+              <w:left w:val="none" w:color="FFFFFF" w:sz="0"/>
+              <w:bottom w:val="none" w:color="FFFFFF" w:sz="0"/>
+              <w:right w:val="none" w:color="FFFFFF" w:sz="0"/>
+            </w:tcBorders>
+            <w:tcMar>
+              <w:top w:type="dxa" w:w="40"/>
+              <w:left w:type="dxa" w:w="70"/>
+              <w:bottom w:type="dxa" w:w="40"/>
+              <w:right w:type="dxa" w:w="70"/>
+            </w:tcMar>
+          </w:tcPr>
+          <w:p>
+            <w:pPr>
+              <w:jc w:val="left"/>
+            </w:pPr>
+            <w:r>
+              <w:rPr>
+                <w:rFonts w:ascii="Times New Roman" w:cs="Times New Roman" w:eastAsia="Times New Roman" w:hAnsi="Times New Roman"/>
+                <w:b w:val="false"/>
+                <w:bCs w:val="false"/>
+                <w:sz w:val="18"/>
+                <w:szCs w:val="18"/>
+              </w:rPr>
+              <w:t xml:space="preserve">Mobility ratio m1 = krg,max μw/μg; compressibility = rock + CO₂.</w:t>
+            </w:r>
+          </w:p>
+        </w:tc>
+      </w:tr>
+      <w:tr>
+        <w:trPr>
+          <w:cantSplit/>
+        </w:trPr>
+        <w:tc>
+          <w:tcPr>
+            <w:tcBorders>
+              <w:top w:val="none" w:color="FFFFFF" w:sz="0"/>
+              <w:left w:val="none" w:color="FFFFFF" w:sz="0"/>
+              <w:bottom w:val="none" w:color="FFFFFF" w:sz="0"/>
+              <w:right w:val="none" w:color="FFFFFF" w:sz="0"/>
+            </w:tcBorders>
+            <w:tcMar>
+              <w:top w:type="dxa" w:w="40"/>
+              <w:left w:type="dxa" w:w="70"/>
+              <w:bottom w:type="dxa" w:w="40"/>
+              <w:right w:type="dxa" w:w="70"/>
+            </w:tcMar>
+          </w:tcPr>
+          <w:p>
+            <w:pPr>
+              <w:jc w:val="left"/>
+            </w:pPr>
+            <w:r>
+              <w:rPr>
+                <w:rFonts w:ascii="Times New Roman" w:cs="Times New Roman" w:eastAsia="Times New Roman" w:hAnsi="Times New Roman"/>
+                <w:b w:val="false"/>
+                <w:bCs w:val="false"/>
+                <w:sz w:val="18"/>
+                <w:szCs w:val="18"/>
+              </w:rPr>
+              <w:t xml:space="preserve">Zone 2 (CO₂ + brine)</w:t>
+            </w:r>
+          </w:p>
+        </w:tc>
+        <w:tc>
+          <w:tcPr>
+            <w:tcBorders>
+              <w:top w:val="none" w:color="FFFFFF" w:sz="0"/>
+              <w:left w:val="none" w:color="FFFFFF" w:sz="0"/>
+              <w:bottom w:val="none" w:color="FFFFFF" w:sz="0"/>
+              <w:right w:val="none" w:color="FFFFFF" w:sz="0"/>
+            </w:tcBorders>
+            <w:tcMar>
+              <w:top w:type="dxa" w:w="40"/>
+              <w:left w:type="dxa" w:w="70"/>
+              <w:bottom w:type="dxa" w:w="40"/>
+              <w:right w:type="dxa" w:w="70"/>
+            </w:tcMar>
+          </w:tcPr>
+          <w:p>
+            <w:pPr>
+              <w:jc w:val="left"/>
+            </w:pPr>
+            <w:r>
+              <w:rPr>
+                <w:rFonts w:ascii="Times New Roman" w:cs="Times New Roman" w:eastAsia="Times New Roman" w:hAnsi="Times New Roman"/>
+                <w:b w:val="false"/>
+                <w:bCs w:val="false"/>
+                <w:sz w:val="18"/>
+                <w:szCs w:val="18"/>
+              </w:rPr>
+              <w:t xml:space="preserve">Evaluated at the average CO₂ saturation behind the front (1/β, shown under the plume table); mobility from the relative-permeability curves; compressibility from the saturation-weighted brine and CO₂.</w:t>
+            </w:r>
+          </w:p>
+        </w:tc>
+      </w:tr>
+      <w:tr>
+        <w:trPr>
+          <w:cantSplit/>
+        </w:trPr>
+        <w:tc>
+          <w:tcPr>
+            <w:tcBorders>
+              <w:top w:val="none" w:color="FFFFFF" w:sz="0"/>
+              <w:left w:val="none" w:color="FFFFFF" w:sz="0"/>
+              <w:bottom w:val="none" w:color="FFFFFF" w:sz="0"/>
+              <w:right w:val="none" w:color="FFFFFF" w:sz="0"/>
+            </w:tcBorders>
+            <w:tcMar>
+              <w:top w:type="dxa" w:w="40"/>
+              <w:left w:type="dxa" w:w="70"/>
+              <w:bottom w:type="dxa" w:w="40"/>
+              <w:right w:type="dxa" w:w="70"/>
+            </w:tcMar>
+          </w:tcPr>
+          <w:p>
+            <w:pPr>
+              <w:jc w:val="left"/>
+            </w:pPr>
+            <w:r>
+              <w:rPr>
+                <w:rFonts w:ascii="Times New Roman" w:cs="Times New Roman" w:eastAsia="Times New Roman" w:hAnsi="Times New Roman"/>
+                <w:b w:val="false"/>
+                <w:bCs w:val="false"/>
+                <w:sz w:val="18"/>
+                <w:szCs w:val="18"/>
+              </w:rPr>
+              <w:t xml:space="preserve">Zone 3 (brine)</w:t>
+            </w:r>
+          </w:p>
+        </w:tc>
+        <w:tc>
+          <w:tcPr>
+            <w:tcBorders>
+              <w:top w:val="none" w:color="FFFFFF" w:sz="0"/>
+              <w:left w:val="none" w:color="FFFFFF" w:sz="0"/>
+              <w:bottom w:val="none" w:color="FFFFFF" w:sz="0"/>
+              <w:right w:val="none" w:color="FFFFFF" w:sz="0"/>
+            </w:tcBorders>
+            <w:tcMar>
+              <w:top w:type="dxa" w:w="40"/>
+              <w:left w:type="dxa" w:w="70"/>
+              <w:bottom w:type="dxa" w:w="40"/>
+              <w:right w:type="dxa" w:w="70"/>
+            </w:tcMar>
+          </w:tcPr>
+          <w:p>
+            <w:pPr>
+              <w:jc w:val="left"/>
+            </w:pPr>
+            <w:r>
+              <w:rPr>
+                <w:rFonts w:ascii="Times New Roman" w:cs="Times New Roman" w:eastAsia="Times New Roman" w:hAnsi="Times New Roman"/>
+                <w:b w:val="false"/>
+                <w:bCs w:val="false"/>
+                <w:sz w:val="18"/>
+                <w:szCs w:val="18"/>
+              </w:rPr>
+              <w:t xml:space="preserve">Mobility ratio 1, compressibility = the total compressibility entered above.</w:t>
+            </w:r>
+          </w:p>
+        </w:tc>
+      </w:tr>
+      <w:tr>
+        <w:trPr>
+          <w:cantSplit/>
+        </w:trPr>
+        <w:tc>
+          <w:tcPr>
+            <w:tcBorders>
+              <w:top w:val="none" w:color="FFFFFF" w:sz="0"/>
+              <w:left w:val="none" w:color="FFFFFF" w:sz="0"/>
+              <w:bottom w:val="none" w:color="FFFFFF" w:sz="0"/>
+              <w:right w:val="none" w:color="FFFFFF" w:sz="0"/>
+            </w:tcBorders>
+            <w:tcMar>
+              <w:top w:type="dxa" w:w="40"/>
+              <w:left w:type="dxa" w:w="70"/>
+              <w:bottom w:type="dxa" w:w="40"/>
+              <w:right w:type="dxa" w:w="70"/>
+            </w:tcMar>
+          </w:tcPr>
+          <w:p>
+            <w:pPr>
+              <w:jc w:val="left"/>
+            </w:pPr>
+            <w:r>
+              <w:rPr>
+                <w:rFonts w:ascii="Times New Roman" w:cs="Times New Roman" w:eastAsia="Times New Roman" w:hAnsi="Times New Roman"/>
+                <w:b w:val="false"/>
+                <w:bCs w:val="false"/>
+                <w:sz w:val="18"/>
+                <w:szCs w:val="18"/>
+              </w:rPr>
+              <w:t xml:space="preserve">Rock and CO₂ compressibility</w:t>
+            </w:r>
+          </w:p>
+        </w:tc>
+        <w:tc>
+          <w:tcPr>
+            <w:tcBorders>
+              <w:top w:val="none" w:color="FFFFFF" w:sz="0"/>
+              <w:left w:val="none" w:color="FFFFFF" w:sz="0"/>
+              <w:bottom w:val="none" w:color="FFFFFF" w:sz="0"/>
+              <w:right w:val="none" w:color="FFFFFF" w:sz="0"/>
+            </w:tcBorders>
+            <w:tcMar>
+              <w:top w:type="dxa" w:w="40"/>
+              <w:left w:type="dxa" w:w="70"/>
+              <w:bottom w:type="dxa" w:w="40"/>
+              <w:right w:type="dxa" w:w="70"/>
+            </w:tcMar>
+          </w:tcPr>
+          <w:p>
+            <w:pPr>
+              <w:jc w:val="left"/>
+            </w:pPr>
+            <w:r>
+              <w:rPr>
+                <w:rFonts w:ascii="Times New Roman" w:cs="Times New Roman" w:eastAsia="Times New Roman" w:hAnsi="Times New Roman"/>
+                <w:b w:val="false"/>
+                <w:bCs w:val="false"/>
+                <w:sz w:val="18"/>
+                <w:szCs w:val="18"/>
+              </w:rPr>
+              <w:t xml:space="preserve">Two extra inputs (default 4×10⁻⁵ and 0.02 1/MPa). The brine compressibility is the total minus the rock value.</w:t>
+            </w:r>
+          </w:p>
+        </w:tc>
+      </w:tr>
+      <w:tr>
+        <w:trPr>
+          <w:cantSplit/>
+        </w:trPr>
+        <w:tc>
+          <w:tcPr>
+            <w:tcBorders>
+              <w:top w:val="none" w:color="FFFFFF" w:sz="0"/>
+              <w:left w:val="none" w:color="FFFFFF" w:sz="0"/>
+              <w:bottom w:val="none" w:color="FFFFFF" w:sz="0"/>
+              <w:right w:val="none" w:color="FFFFFF" w:sz="0"/>
+            </w:tcBorders>
+            <w:tcMar>
+              <w:top w:type="dxa" w:w="40"/>
+              <w:left w:type="dxa" w:w="70"/>
+              <w:bottom w:type="dxa" w:w="40"/>
+              <w:right w:type="dxa" w:w="70"/>
+            </w:tcMar>
+          </w:tcPr>
+          <w:p>
+            <w:pPr>
+              <w:jc w:val="left"/>
+            </w:pPr>
+            <w:r>
+              <w:rPr>
+                <w:rFonts w:ascii="Times New Roman" w:cs="Times New Roman" w:eastAsia="Times New Roman" w:hAnsi="Times New Roman"/>
+                <w:b w:val="false"/>
+                <w:bCs w:val="false"/>
+                <w:sz w:val="18"/>
+                <w:szCs w:val="18"/>
+              </w:rPr>
+              <w:t xml:space="preserve">Fronts</w:t>
+            </w:r>
+          </w:p>
+        </w:tc>
+        <w:tc>
+          <w:tcPr>
+            <w:tcBorders>
+              <w:top w:val="none" w:color="FFFFFF" w:sz="0"/>
+              <w:left w:val="none" w:color="FFFFFF" w:sz="0"/>
+              <w:bottom w:val="none" w:color="FFFFFF" w:sz="0"/>
+              <w:right w:val="none" w:color="FFFFFF" w:sz="0"/>
+            </w:tcBorders>
+            <w:tcMar>
+              <w:top w:type="dxa" w:w="40"/>
+              <w:left w:type="dxa" w:w="70"/>
+              <w:bottom w:type="dxa" w:w="40"/>
+              <w:right w:type="dxa" w:w="70"/>
+            </w:tcMar>
+          </w:tcPr>
+          <w:p>
+            <w:pPr>
+              <w:jc w:val="left"/>
+            </w:pPr>
+            <w:r>
+              <w:rPr>
+                <w:rFonts w:ascii="Times New Roman" w:cs="Times New Roman" w:eastAsia="Times New Roman" w:hAnsi="Times New Roman"/>
+                <w:b w:val="false"/>
+                <w:bCs w:val="false"/>
+                <w:sz w:val="18"/>
+                <w:szCs w:val="18"/>
+              </w:rPr>
+              <w:t xml:space="preserve">Dry front and gas front radii from the dry-out and saturation inputs; both grow with the square root of time.</w:t>
+            </w:r>
+          </w:p>
+        </w:tc>
+      </w:tr>
+      <w:tr>
+        <w:trPr>
+          <w:cantSplit/>
+        </w:trPr>
+        <w:tc>
+          <w:tcPr>
+            <w:tcBorders>
+              <w:top w:val="none" w:color="FFFFFF" w:sz="0"/>
+              <w:left w:val="none" w:color="FFFFFF" w:sz="0"/>
+              <w:bottom w:val="single" w:color="111111" w:sz="8"/>
+              <w:right w:val="none" w:color="FFFFFF" w:sz="0"/>
+            </w:tcBorders>
+            <w:tcMar>
+              <w:top w:type="dxa" w:w="40"/>
+              <w:left w:type="dxa" w:w="70"/>
+              <w:bottom w:type="dxa" w:w="40"/>
+              <w:right w:type="dxa" w:w="70"/>
+            </w:tcMar>
+          </w:tcPr>
+          <w:p>
+            <w:pPr>
+              <w:jc w:val="left"/>
+            </w:pPr>
+            <w:r>
+              <w:rPr>
+                <w:rFonts w:ascii="Times New Roman" w:cs="Times New Roman" w:eastAsia="Times New Roman" w:hAnsi="Times New Roman"/>
+                <w:b w:val="false"/>
+                <w:bCs w:val="false"/>
+                <w:sz w:val="18"/>
+                <w:szCs w:val="18"/>
+              </w:rPr>
+              <w:t xml:space="preserve">Rate changes</w:t>
+            </w:r>
+          </w:p>
+        </w:tc>
+        <w:tc>
+          <w:tcPr>
+            <w:tcBorders>
+              <w:top w:val="none" w:color="FFFFFF" w:sz="0"/>
+              <w:left w:val="none" w:color="FFFFFF" w:sz="0"/>
+              <w:bottom w:val="single" w:color="111111" w:sz="8"/>
+              <w:right w:val="none" w:color="FFFFFF" w:sz="0"/>
+            </w:tcBorders>
+            <w:tcMar>
+              <w:top w:type="dxa" w:w="40"/>
+              <w:left w:type="dxa" w:w="70"/>
+              <w:bottom w:type="dxa" w:w="40"/>
+              <w:right w:type="dxa" w:w="70"/>
+            </w:tcMar>
+          </w:tcPr>
+          <w:p>
+            <w:pPr>
+              <w:jc w:val="left"/>
+            </w:pPr>
+            <w:r>
+              <w:rPr>
+                <w:rFonts w:ascii="Times New Roman" w:cs="Times New Roman" w:eastAsia="Times New Roman" w:hAnsi="Times New Roman"/>
+                <w:b w:val="false"/>
+                <w:bCs w:val="false"/>
+                <w:sz w:val="18"/>
+                <w:szCs w:val="18"/>
+              </w:rPr>
+              <w:t xml:space="preserve">Each rate period uses the kernel with its own rate; a shut-in uses the rate it stops.</w:t>
+            </w:r>
+          </w:p>
+        </w:tc>
+      </w:tr>
+    </w:tbl>
+    <w:p>
+      <w:pPr>
+        <w:spacing w:after="80" w:before="40"/>
+      </w:pPr>
+      <w:r>
+        <w:rPr>
+          <w:rFonts w:ascii="Times New Roman" w:cs="Times New Roman" w:eastAsia="Times New Roman" w:hAnsi="Times New Roman"/>
+          <w:i/>
+          <w:iCs/>
+          <w:sz w:val="17"/>
+          <w:szCs w:val="17"/>
+        </w:rPr>
+        <w:t xml:space="preserve">In practice the model lowers the pressure next to each well (CO₂ is more mobile than brine) and leaves the pressure far from the wells close to the brine-equivalent value.</w:t>
+      </w:r>
+    </w:p>
+    <w:p>
+      <w:pPr>
+        <w:pStyle w:val="Heading2"/>
+        <w:keepNext/>
+        <w:spacing w:after="60" w:before="160"/>
+      </w:pPr>
+      <w:r>
+        <w:rPr>
+          <w:rFonts w:ascii="Times New Roman" w:cs="Times New Roman" w:eastAsia="Times New Roman" w:hAnsi="Times New Roman"/>
+          <w:b/>
+          <w:bCs/>
+          <w:sz w:val="22"/>
+          <w:szCs w:val="22"/>
+        </w:rPr>
         <w:t xml:space="preserve">4.3 Pressure limit</w:t>
       </w:r>
     </w:p>
@@ -4419,7 +5035,7 @@
       <w:r>
         <w:drawing>
           <wp:inline distT="0" distB="0" distL="0" distR="0">
-            <wp:extent cx="4591050" cy="4000500"/>
+            <wp:extent cx="4600575" cy="4000500"/>
             <wp:effectExtent t="0" r="0" b="0" l="0"/>
             <wp:docPr id="4" name="figure" descr="Figure 4. The Injection wells section." title="Figure 4. The Injection wells section."/>
             <wp:cNvGraphicFramePr>
@@ -4444,7 +5060,7 @@
                   <pic:spPr bwMode="auto">
                     <a:xfrm>
                       <a:off x="0" y="0"/>
-                      <a:ext cx="4591050" cy="4000500"/>
+                      <a:ext cx="4600575" cy="4000500"/>
                     </a:xfrm>
                     <a:prstGeom prst="rect">
                       <a:avLst/>
@@ -5227,7 +5843,7 @@
       <w:r>
         <w:drawing>
           <wp:inline distT="0" distB="0" distL="0" distR="0">
-            <wp:extent cx="4067175" cy="4000500"/>
+            <wp:extent cx="4076700" cy="4000500"/>
             <wp:effectExtent t="0" r="0" b="0" l="0"/>
             <wp:docPr id="5" name="figure" descr="Figure 5. The wells table in longitude / latitude mode." title="Figure 5. The wells table in longitude / latitude mode."/>
             <wp:cNvGraphicFramePr>
@@ -5252,7 +5868,7 @@
                   <pic:spPr bwMode="auto">
                     <a:xfrm>
                       <a:off x="0" y="0"/>
-                      <a:ext cx="4067175" cy="4000500"/>
+                      <a:ext cx="4076700" cy="4000500"/>
                     </a:xfrm>
                     <a:prstGeom prst="rect">
                       <a:avLst/>
@@ -5895,7 +6511,7 @@
       <w:r>
         <w:drawing>
           <wp:inline distT="0" distB="0" distL="0" distR="0">
-            <wp:extent cx="5334000" cy="1819275"/>
+            <wp:extent cx="5334000" cy="1838325"/>
             <wp:effectExtent t="0" r="0" b="0" l="0"/>
             <wp:docPr id="10" name="figure" descr="Figure 10. Limit check for each well and the monitoring-point table." title="Figure 10. Limit check for each well and the monitoring-point table."/>
             <wp:cNvGraphicFramePr>
@@ -5920,7 +6536,7 @@
                   <pic:spPr bwMode="auto">
                     <a:xfrm>
                       <a:off x="0" y="0"/>
-                      <a:ext cx="5334000" cy="1819275"/>
+                      <a:ext cx="5334000" cy="1838325"/>
                     </a:xfrm>
                     <a:prstGeom prst="rect">
                       <a:avLst/>
@@ -7067,7 +7683,7 @@
           <w:sz w:val="22"/>
           <w:szCs w:val="22"/>
         </w:rPr>
-        <w:t xml:space="preserve">The pressure calculation uses the single-phase (brine-equivalent) kernel everywhere; the different mobility and compressibility of the dry, two-phase and brine zones are not included in the pressure response.</w:t>
+        <w:t xml:space="preserve">The three-zone pressure model treats the dry and gas fronts as sharp and uses the average saturation behind the front for the two-phase zone; with rate changes each period uses its own rate for the front positions. The single-phase option ignores the CO₂ zones altogether.</w:t>
       </w:r>
     </w:p>
     <w:p>

</xml_diff>

<commit_message>
Dry-out parameters are ordinary Input parameters (no separate subsection)
Co-Authored-By: Claude Sonnet 5.5 <noreply@anthropic.com>
</commit_message>
<xml_diff>
--- a/public/manual/user-manual.docx
+++ b/public/manual/user-manual.docx
@@ -1317,7 +1317,7 @@
       <w:r>
         <w:drawing>
           <wp:inline distT="0" distB="0" distL="0" distR="0">
-            <wp:extent cx="4829175" cy="4000500"/>
+            <wp:extent cx="3743325" cy="4000500"/>
             <wp:effectExtent t="0" r="0" b="0" l="0"/>
             <wp:docPr id="2" name="figure" descr="Figure 2. The Input section with a unit selector beside every value." title="Figure 2. The Input section with a unit selector beside every value."/>
             <wp:cNvGraphicFramePr>
@@ -1342,7 +1342,7 @@
                   <pic:spPr bwMode="auto">
                     <a:xfrm>
                       <a:off x="0" y="0"/>
-                      <a:ext cx="4829175" cy="4000500"/>
+                      <a:ext cx="3743325" cy="4000500"/>
                     </a:xfrm>
                     <a:prstGeom prst="rect">
                       <a:avLst/>
@@ -2410,6 +2410,398 @@
             <w:tcBorders>
               <w:top w:val="none" w:color="FFFFFF" w:sz="0"/>
               <w:left w:val="none" w:color="FFFFFF" w:sz="0"/>
+              <w:bottom w:val="none" w:color="FFFFFF" w:sz="0"/>
+              <w:right w:val="none" w:color="FFFFFF" w:sz="0"/>
+            </w:tcBorders>
+            <w:tcMar>
+              <w:top w:type="dxa" w:w="40"/>
+              <w:left w:type="dxa" w:w="70"/>
+              <w:bottom w:type="dxa" w:w="40"/>
+              <w:right w:type="dxa" w:w="70"/>
+            </w:tcMar>
+          </w:tcPr>
+          <w:p>
+            <w:pPr>
+              <w:jc w:val="left"/>
+            </w:pPr>
+            <w:r>
+              <w:rPr>
+                <w:rFonts w:ascii="Times New Roman" w:cs="Times New Roman" w:eastAsia="Times New Roman" w:hAnsi="Times New Roman"/>
+                <w:b w:val="false"/>
+                <w:bCs w:val="false"/>
+                <w:sz w:val="18"/>
+                <w:szCs w:val="18"/>
+              </w:rPr>
+              <w:t xml:space="preserve">Analysis horizon</w:t>
+            </w:r>
+          </w:p>
+        </w:tc>
+        <w:tc>
+          <w:tcPr>
+            <w:tcBorders>
+              <w:top w:val="none" w:color="FFFFFF" w:sz="0"/>
+              <w:left w:val="none" w:color="FFFFFF" w:sz="0"/>
+              <w:bottom w:val="none" w:color="FFFFFF" w:sz="0"/>
+              <w:right w:val="none" w:color="FFFFFF" w:sz="0"/>
+            </w:tcBorders>
+            <w:tcMar>
+              <w:top w:type="dxa" w:w="40"/>
+              <w:left w:type="dxa" w:w="70"/>
+              <w:bottom w:type="dxa" w:w="40"/>
+              <w:right w:type="dxa" w:w="70"/>
+            </w:tcMar>
+          </w:tcPr>
+          <w:p>
+            <w:pPr>
+              <w:jc w:val="left"/>
+            </w:pPr>
+            <w:r>
+              <w:rPr>
+                <w:rFonts w:ascii="Times New Roman" w:cs="Times New Roman" w:eastAsia="Times New Roman" w:hAnsi="Times New Roman"/>
+                <w:b w:val="false"/>
+                <w:bCs w:val="false"/>
+                <w:sz w:val="18"/>
+                <w:szCs w:val="18"/>
+              </w:rPr>
+              <w:t xml:space="preserve">Length of the time series, in years. The evaluation-time slider runs from 0 to this value.</w:t>
+            </w:r>
+          </w:p>
+        </w:tc>
+        <w:tc>
+          <w:tcPr>
+            <w:tcBorders>
+              <w:top w:val="none" w:color="FFFFFF" w:sz="0"/>
+              <w:left w:val="none" w:color="FFFFFF" w:sz="0"/>
+              <w:bottom w:val="none" w:color="FFFFFF" w:sz="0"/>
+              <w:right w:val="none" w:color="FFFFFF" w:sz="0"/>
+            </w:tcBorders>
+            <w:tcMar>
+              <w:top w:type="dxa" w:w="40"/>
+              <w:left w:type="dxa" w:w="70"/>
+              <w:bottom w:type="dxa" w:w="40"/>
+              <w:right w:type="dxa" w:w="70"/>
+            </w:tcMar>
+          </w:tcPr>
+          <w:p>
+            <w:pPr>
+              <w:jc w:val="left"/>
+            </w:pPr>
+            <w:r>
+              <w:rPr>
+                <w:rFonts w:ascii="Times New Roman" w:cs="Times New Roman" w:eastAsia="Times New Roman" w:hAnsi="Times New Roman"/>
+                <w:b w:val="false"/>
+                <w:bCs w:val="false"/>
+                <w:sz w:val="18"/>
+                <w:szCs w:val="18"/>
+              </w:rPr>
+              <w:t xml:space="preserve">20 to 100 yr</w:t>
+            </w:r>
+          </w:p>
+        </w:tc>
+      </w:tr>
+      <w:tr>
+        <w:trPr>
+          <w:cantSplit/>
+        </w:trPr>
+        <w:tc>
+          <w:tcPr>
+            <w:tcBorders>
+              <w:top w:val="none" w:color="FFFFFF" w:sz="0"/>
+              <w:left w:val="none" w:color="FFFFFF" w:sz="0"/>
+              <w:bottom w:val="none" w:color="FFFFFF" w:sz="0"/>
+              <w:right w:val="none" w:color="FFFFFF" w:sz="0"/>
+            </w:tcBorders>
+            <w:tcMar>
+              <w:top w:type="dxa" w:w="40"/>
+              <w:left w:type="dxa" w:w="70"/>
+              <w:bottom w:type="dxa" w:w="40"/>
+              <w:right w:type="dxa" w:w="70"/>
+            </w:tcMar>
+          </w:tcPr>
+          <w:p>
+            <w:pPr>
+              <w:jc w:val="left"/>
+            </w:pPr>
+            <w:r>
+              <w:rPr>
+                <w:rFonts w:ascii="Times New Roman" w:cs="Times New Roman" w:eastAsia="Times New Roman" w:hAnsi="Times New Roman"/>
+                <w:b w:val="false"/>
+                <w:bCs w:val="false"/>
+                <w:sz w:val="18"/>
+                <w:szCs w:val="18"/>
+              </w:rPr>
+              <w:t xml:space="preserve">Reservoir temperature</w:t>
+            </w:r>
+          </w:p>
+        </w:tc>
+        <w:tc>
+          <w:tcPr>
+            <w:tcBorders>
+              <w:top w:val="none" w:color="FFFFFF" w:sz="0"/>
+              <w:left w:val="none" w:color="FFFFFF" w:sz="0"/>
+              <w:bottom w:val="none" w:color="FFFFFF" w:sz="0"/>
+              <w:right w:val="none" w:color="FFFFFF" w:sz="0"/>
+            </w:tcBorders>
+            <w:tcMar>
+              <w:top w:type="dxa" w:w="40"/>
+              <w:left w:type="dxa" w:w="70"/>
+              <w:bottom w:type="dxa" w:w="40"/>
+              <w:right w:type="dxa" w:w="70"/>
+            </w:tcMar>
+          </w:tcPr>
+          <w:p>
+            <w:pPr>
+              <w:jc w:val="left"/>
+            </w:pPr>
+            <w:r>
+              <w:rPr>
+                <w:rFonts w:ascii="Times New Roman" w:cs="Times New Roman" w:eastAsia="Times New Roman" w:hAnsi="Times New Roman"/>
+                <w:b w:val="false"/>
+                <w:bCs w:val="false"/>
+                <w:sz w:val="18"/>
+                <w:szCs w:val="18"/>
+              </w:rPr>
+              <w:t xml:space="preserve">Used for the dry-zone calculation (water content of CO₂).</w:t>
+            </w:r>
+          </w:p>
+        </w:tc>
+        <w:tc>
+          <w:tcPr>
+            <w:tcBorders>
+              <w:top w:val="none" w:color="FFFFFF" w:sz="0"/>
+              <w:left w:val="none" w:color="FFFFFF" w:sz="0"/>
+              <w:bottom w:val="none" w:color="FFFFFF" w:sz="0"/>
+              <w:right w:val="none" w:color="FFFFFF" w:sz="0"/>
+            </w:tcBorders>
+            <w:tcMar>
+              <w:top w:type="dxa" w:w="40"/>
+              <w:left w:type="dxa" w:w="70"/>
+              <w:bottom w:type="dxa" w:w="40"/>
+              <w:right w:type="dxa" w:w="70"/>
+            </w:tcMar>
+          </w:tcPr>
+          <w:p>
+            <w:pPr>
+              <w:jc w:val="left"/>
+            </w:pPr>
+            <w:r>
+              <w:rPr>
+                <w:rFonts w:ascii="Times New Roman" w:cs="Times New Roman" w:eastAsia="Times New Roman" w:hAnsi="Times New Roman"/>
+                <w:b w:val="false"/>
+                <w:bCs w:val="false"/>
+                <w:sz w:val="18"/>
+                <w:szCs w:val="18"/>
+              </w:rPr>
+              <w:t xml:space="preserve">40 to 120 °C</w:t>
+            </w:r>
+          </w:p>
+        </w:tc>
+      </w:tr>
+      <w:tr>
+        <w:trPr>
+          <w:cantSplit/>
+        </w:trPr>
+        <w:tc>
+          <w:tcPr>
+            <w:tcBorders>
+              <w:top w:val="none" w:color="FFFFFF" w:sz="0"/>
+              <w:left w:val="none" w:color="FFFFFF" w:sz="0"/>
+              <w:bottom w:val="none" w:color="FFFFFF" w:sz="0"/>
+              <w:right w:val="none" w:color="FFFFFF" w:sz="0"/>
+            </w:tcBorders>
+            <w:tcMar>
+              <w:top w:type="dxa" w:w="40"/>
+              <w:left w:type="dxa" w:w="70"/>
+              <w:bottom w:type="dxa" w:w="40"/>
+              <w:right w:type="dxa" w:w="70"/>
+            </w:tcMar>
+          </w:tcPr>
+          <w:p>
+            <w:pPr>
+              <w:jc w:val="left"/>
+            </w:pPr>
+            <w:r>
+              <w:rPr>
+                <w:rFonts w:ascii="Times New Roman" w:cs="Times New Roman" w:eastAsia="Times New Roman" w:hAnsi="Times New Roman"/>
+                <w:b w:val="false"/>
+                <w:bCs w:val="false"/>
+                <w:sz w:val="18"/>
+                <w:szCs w:val="18"/>
+              </w:rPr>
+              <w:t xml:space="preserve">Brine salinity (NaCl)</w:t>
+            </w:r>
+          </w:p>
+        </w:tc>
+        <w:tc>
+          <w:tcPr>
+            <w:tcBorders>
+              <w:top w:val="none" w:color="FFFFFF" w:sz="0"/>
+              <w:left w:val="none" w:color="FFFFFF" w:sz="0"/>
+              <w:bottom w:val="none" w:color="FFFFFF" w:sz="0"/>
+              <w:right w:val="none" w:color="FFFFFF" w:sz="0"/>
+            </w:tcBorders>
+            <w:tcMar>
+              <w:top w:type="dxa" w:w="40"/>
+              <w:left w:type="dxa" w:w="70"/>
+              <w:bottom w:type="dxa" w:w="40"/>
+              <w:right w:type="dxa" w:w="70"/>
+            </w:tcMar>
+          </w:tcPr>
+          <w:p>
+            <w:pPr>
+              <w:jc w:val="left"/>
+            </w:pPr>
+            <w:r>
+              <w:rPr>
+                <w:rFonts w:ascii="Times New Roman" w:cs="Times New Roman" w:eastAsia="Times New Roman" w:hAnsi="Times New Roman"/>
+                <w:b w:val="false"/>
+                <w:bCs w:val="false"/>
+                <w:sz w:val="18"/>
+                <w:szCs w:val="18"/>
+              </w:rPr>
+              <w:t xml:space="preserve">NaCl mass fraction of the brine; lowers the water activity.</w:t>
+            </w:r>
+          </w:p>
+        </w:tc>
+        <w:tc>
+          <w:tcPr>
+            <w:tcBorders>
+              <w:top w:val="none" w:color="FFFFFF" w:sz="0"/>
+              <w:left w:val="none" w:color="FFFFFF" w:sz="0"/>
+              <w:bottom w:val="none" w:color="FFFFFF" w:sz="0"/>
+              <w:right w:val="none" w:color="FFFFFF" w:sz="0"/>
+            </w:tcBorders>
+            <w:tcMar>
+              <w:top w:type="dxa" w:w="40"/>
+              <w:left w:type="dxa" w:w="70"/>
+              <w:bottom w:type="dxa" w:w="40"/>
+              <w:right w:type="dxa" w:w="70"/>
+            </w:tcMar>
+          </w:tcPr>
+          <w:p>
+            <w:pPr>
+              <w:jc w:val="left"/>
+            </w:pPr>
+            <w:r>
+              <w:rPr>
+                <w:rFonts w:ascii="Times New Roman" w:cs="Times New Roman" w:eastAsia="Times New Roman" w:hAnsi="Times New Roman"/>
+                <w:b w:val="false"/>
+                <w:bCs w:val="false"/>
+                <w:sz w:val="18"/>
+                <w:szCs w:val="18"/>
+              </w:rPr>
+              <w:t xml:space="preserve">0 to 0.26</w:t>
+            </w:r>
+          </w:p>
+        </w:tc>
+      </w:tr>
+      <w:tr>
+        <w:trPr>
+          <w:cantSplit/>
+        </w:trPr>
+        <w:tc>
+          <w:tcPr>
+            <w:tcBorders>
+              <w:top w:val="none" w:color="FFFFFF" w:sz="0"/>
+              <w:left w:val="none" w:color="FFFFFF" w:sz="0"/>
+              <w:bottom w:val="none" w:color="FFFFFF" w:sz="0"/>
+              <w:right w:val="none" w:color="FFFFFF" w:sz="0"/>
+            </w:tcBorders>
+            <w:tcMar>
+              <w:top w:type="dxa" w:w="40"/>
+              <w:left w:type="dxa" w:w="70"/>
+              <w:bottom w:type="dxa" w:w="40"/>
+              <w:right w:type="dxa" w:w="70"/>
+            </w:tcMar>
+          </w:tcPr>
+          <w:p>
+            <w:pPr>
+              <w:jc w:val="left"/>
+            </w:pPr>
+            <w:r>
+              <w:rPr>
+                <w:rFonts w:ascii="Times New Roman" w:cs="Times New Roman" w:eastAsia="Times New Roman" w:hAnsi="Times New Roman"/>
+                <w:b w:val="false"/>
+                <w:bCs w:val="false"/>
+                <w:sz w:val="18"/>
+                <w:szCs w:val="18"/>
+              </w:rPr>
+              <w:t xml:space="preserve">Brine density</w:t>
+            </w:r>
+          </w:p>
+        </w:tc>
+        <w:tc>
+          <w:tcPr>
+            <w:tcBorders>
+              <w:top w:val="none" w:color="FFFFFF" w:sz="0"/>
+              <w:left w:val="none" w:color="FFFFFF" w:sz="0"/>
+              <w:bottom w:val="none" w:color="FFFFFF" w:sz="0"/>
+              <w:right w:val="none" w:color="FFFFFF" w:sz="0"/>
+            </w:tcBorders>
+            <w:tcMar>
+              <w:top w:type="dxa" w:w="40"/>
+              <w:left w:type="dxa" w:w="70"/>
+              <w:bottom w:type="dxa" w:w="40"/>
+              <w:right w:type="dxa" w:w="70"/>
+            </w:tcMar>
+          </w:tcPr>
+          <w:p>
+            <w:pPr>
+              <w:jc w:val="left"/>
+            </w:pPr>
+            <w:r>
+              <w:rPr>
+                <w:rFonts w:ascii="Times New Roman" w:cs="Times New Roman" w:eastAsia="Times New Roman" w:hAnsi="Times New Roman"/>
+                <w:b w:val="false"/>
+                <w:bCs w:val="false"/>
+                <w:sz w:val="18"/>
+                <w:szCs w:val="18"/>
+              </w:rPr>
+              <w:t xml:space="preserve">Density of the formation brine at reservoir conditions.</w:t>
+            </w:r>
+          </w:p>
+        </w:tc>
+        <w:tc>
+          <w:tcPr>
+            <w:tcBorders>
+              <w:top w:val="none" w:color="FFFFFF" w:sz="0"/>
+              <w:left w:val="none" w:color="FFFFFF" w:sz="0"/>
+              <w:bottom w:val="none" w:color="FFFFFF" w:sz="0"/>
+              <w:right w:val="none" w:color="FFFFFF" w:sz="0"/>
+            </w:tcBorders>
+            <w:tcMar>
+              <w:top w:type="dxa" w:w="40"/>
+              <w:left w:type="dxa" w:w="70"/>
+              <w:bottom w:type="dxa" w:w="40"/>
+              <w:right w:type="dxa" w:w="70"/>
+            </w:tcMar>
+          </w:tcPr>
+          <w:p>
+            <w:pPr>
+              <w:jc w:val="left"/>
+            </w:pPr>
+            <w:r>
+              <w:rPr>
+                <w:rFonts w:ascii="Times New Roman" w:cs="Times New Roman" w:eastAsia="Times New Roman" w:hAnsi="Times New Roman"/>
+                <w:b w:val="false"/>
+                <w:bCs w:val="false"/>
+                <w:sz w:val="18"/>
+                <w:szCs w:val="18"/>
+              </w:rPr>
+              <w:t xml:space="preserve">1000 to 1200 kg/m³</w:t>
+            </w:r>
+          </w:p>
+        </w:tc>
+      </w:tr>
+      <w:tr>
+        <w:trPr>
+          <w:cantSplit/>
+        </w:trPr>
+        <w:tc>
+          <w:tcPr>
+            <w:tcBorders>
+              <w:top w:val="none" w:color="FFFFFF" w:sz="0"/>
+              <w:left w:val="none" w:color="FFFFFF" w:sz="0"/>
               <w:bottom w:val="single" w:color="111111" w:sz="8"/>
               <w:right w:val="none" w:color="FFFFFF" w:sz="0"/>
             </w:tcBorders>
@@ -2432,7 +2824,7 @@
                 <w:sz w:val="18"/>
                 <w:szCs w:val="18"/>
               </w:rPr>
-              <w:t xml:space="preserve">Analysis horizon</w:t>
+              <w:t xml:space="preserve">Water fugacity coeff. Φw</w:t>
             </w:r>
           </w:p>
         </w:tc>
@@ -2463,7 +2855,7 @@
                 <w:sz w:val="18"/>
                 <w:szCs w:val="18"/>
               </w:rPr>
-              <w:t xml:space="preserve">Length of the time series, in years. The evaluation-time slider runs from 0 to this value.</w:t>
+              <w:t xml:space="preserve">Fugacity coefficient of water in the CO₂-rich phase. 1 is the screening approximation; smaller values mean the CO₂ carries more water and the dry zone is larger.</w:t>
             </w:r>
           </w:p>
         </w:tc>
@@ -2494,7 +2886,7 @@
                 <w:sz w:val="18"/>
                 <w:szCs w:val="18"/>
               </w:rPr>
-              <w:t xml:space="preserve">20 to 100 yr</w:t>
+              <w:t xml:space="preserve">0.2 to 1</w:t>
             </w:r>
           </w:p>
         </w:tc>
@@ -4246,7 +4638,7 @@
             <w:tcBorders>
               <w:top w:val="none" w:color="FFFFFF" w:sz="0"/>
               <w:left w:val="none" w:color="FFFFFF" w:sz="0"/>
-              <w:bottom w:val="none" w:color="FFFFFF" w:sz="0"/>
+              <w:bottom w:val="single" w:color="111111" w:sz="8"/>
               <w:right w:val="none" w:color="FFFFFF" w:sz="0"/>
             </w:tcBorders>
             <w:tcMar>
@@ -4277,7 +4669,7 @@
             <w:tcBorders>
               <w:top w:val="none" w:color="FFFFFF" w:sz="0"/>
               <w:left w:val="none" w:color="FFFFFF" w:sz="0"/>
-              <w:bottom w:val="none" w:color="FFFFFF" w:sz="0"/>
+              <w:bottom w:val="single" w:color="111111" w:sz="8"/>
               <w:right w:val="none" w:color="FFFFFF" w:sz="0"/>
             </w:tcBorders>
             <w:tcMar>
@@ -4308,7 +4700,7 @@
             <w:tcBorders>
               <w:top w:val="none" w:color="FFFFFF" w:sz="0"/>
               <w:left w:val="none" w:color="FFFFFF" w:sz="0"/>
-              <w:bottom w:val="none" w:color="FFFFFF" w:sz="0"/>
+              <w:bottom w:val="single" w:color="111111" w:sz="8"/>
               <w:right w:val="none" w:color="FFFFFF" w:sz="0"/>
             </w:tcBorders>
             <w:tcMar>
@@ -4331,398 +4723,6 @@
                 <w:szCs w:val="18"/>
               </w:rPr>
               <w:t xml:space="preserve">0.06 mPa·s</w:t>
-            </w:r>
-          </w:p>
-        </w:tc>
-      </w:tr>
-      <w:tr>
-        <w:trPr>
-          <w:cantSplit/>
-        </w:trPr>
-        <w:tc>
-          <w:tcPr>
-            <w:tcBorders>
-              <w:top w:val="none" w:color="FFFFFF" w:sz="0"/>
-              <w:left w:val="none" w:color="FFFFFF" w:sz="0"/>
-              <w:bottom w:val="none" w:color="FFFFFF" w:sz="0"/>
-              <w:right w:val="none" w:color="FFFFFF" w:sz="0"/>
-            </w:tcBorders>
-            <w:tcMar>
-              <w:top w:type="dxa" w:w="40"/>
-              <w:left w:type="dxa" w:w="70"/>
-              <w:bottom w:type="dxa" w:w="40"/>
-              <w:right w:type="dxa" w:w="70"/>
-            </w:tcMar>
-          </w:tcPr>
-          <w:p>
-            <w:pPr>
-              <w:jc w:val="left"/>
-            </w:pPr>
-            <w:r>
-              <w:rPr>
-                <w:rFonts w:ascii="Times New Roman" w:cs="Times New Roman" w:eastAsia="Times New Roman" w:hAnsi="Times New Roman"/>
-                <w:b w:val="false"/>
-                <w:bCs w:val="false"/>
-                <w:sz w:val="18"/>
-                <w:szCs w:val="18"/>
-              </w:rPr>
-              <w:t xml:space="preserve">Reservoir temperature</w:t>
-            </w:r>
-          </w:p>
-        </w:tc>
-        <w:tc>
-          <w:tcPr>
-            <w:tcBorders>
-              <w:top w:val="none" w:color="FFFFFF" w:sz="0"/>
-              <w:left w:val="none" w:color="FFFFFF" w:sz="0"/>
-              <w:bottom w:val="none" w:color="FFFFFF" w:sz="0"/>
-              <w:right w:val="none" w:color="FFFFFF" w:sz="0"/>
-            </w:tcBorders>
-            <w:tcMar>
-              <w:top w:type="dxa" w:w="40"/>
-              <w:left w:type="dxa" w:w="70"/>
-              <w:bottom w:type="dxa" w:w="40"/>
-              <w:right w:type="dxa" w:w="70"/>
-            </w:tcMar>
-          </w:tcPr>
-          <w:p>
-            <w:pPr>
-              <w:jc w:val="left"/>
-            </w:pPr>
-            <w:r>
-              <w:rPr>
-                <w:rFonts w:ascii="Times New Roman" w:cs="Times New Roman" w:eastAsia="Times New Roman" w:hAnsi="Times New Roman"/>
-                <w:b w:val="false"/>
-                <w:bCs w:val="false"/>
-                <w:sz w:val="18"/>
-                <w:szCs w:val="18"/>
-              </w:rPr>
-              <w:t xml:space="preserve">Used for the dry-zone calculation (water content of CO₂).</w:t>
-            </w:r>
-          </w:p>
-        </w:tc>
-        <w:tc>
-          <w:tcPr>
-            <w:tcBorders>
-              <w:top w:val="none" w:color="FFFFFF" w:sz="0"/>
-              <w:left w:val="none" w:color="FFFFFF" w:sz="0"/>
-              <w:bottom w:val="none" w:color="FFFFFF" w:sz="0"/>
-              <w:right w:val="none" w:color="FFFFFF" w:sz="0"/>
-            </w:tcBorders>
-            <w:tcMar>
-              <w:top w:type="dxa" w:w="40"/>
-              <w:left w:type="dxa" w:w="70"/>
-              <w:bottom w:type="dxa" w:w="40"/>
-              <w:right w:type="dxa" w:w="70"/>
-            </w:tcMar>
-          </w:tcPr>
-          <w:p>
-            <w:pPr>
-              <w:jc w:val="left"/>
-            </w:pPr>
-            <w:r>
-              <w:rPr>
-                <w:rFonts w:ascii="Times New Roman" w:cs="Times New Roman" w:eastAsia="Times New Roman" w:hAnsi="Times New Roman"/>
-                <w:b w:val="false"/>
-                <w:bCs w:val="false"/>
-                <w:sz w:val="18"/>
-                <w:szCs w:val="18"/>
-              </w:rPr>
-              <w:t xml:space="preserve">40 to 120 °C</w:t>
-            </w:r>
-          </w:p>
-        </w:tc>
-      </w:tr>
-      <w:tr>
-        <w:trPr>
-          <w:cantSplit/>
-        </w:trPr>
-        <w:tc>
-          <w:tcPr>
-            <w:tcBorders>
-              <w:top w:val="none" w:color="FFFFFF" w:sz="0"/>
-              <w:left w:val="none" w:color="FFFFFF" w:sz="0"/>
-              <w:bottom w:val="none" w:color="FFFFFF" w:sz="0"/>
-              <w:right w:val="none" w:color="FFFFFF" w:sz="0"/>
-            </w:tcBorders>
-            <w:tcMar>
-              <w:top w:type="dxa" w:w="40"/>
-              <w:left w:type="dxa" w:w="70"/>
-              <w:bottom w:type="dxa" w:w="40"/>
-              <w:right w:type="dxa" w:w="70"/>
-            </w:tcMar>
-          </w:tcPr>
-          <w:p>
-            <w:pPr>
-              <w:jc w:val="left"/>
-            </w:pPr>
-            <w:r>
-              <w:rPr>
-                <w:rFonts w:ascii="Times New Roman" w:cs="Times New Roman" w:eastAsia="Times New Roman" w:hAnsi="Times New Roman"/>
-                <w:b w:val="false"/>
-                <w:bCs w:val="false"/>
-                <w:sz w:val="18"/>
-                <w:szCs w:val="18"/>
-              </w:rPr>
-              <w:t xml:space="preserve">Brine salinity (NaCl)</w:t>
-            </w:r>
-          </w:p>
-        </w:tc>
-        <w:tc>
-          <w:tcPr>
-            <w:tcBorders>
-              <w:top w:val="none" w:color="FFFFFF" w:sz="0"/>
-              <w:left w:val="none" w:color="FFFFFF" w:sz="0"/>
-              <w:bottom w:val="none" w:color="FFFFFF" w:sz="0"/>
-              <w:right w:val="none" w:color="FFFFFF" w:sz="0"/>
-            </w:tcBorders>
-            <w:tcMar>
-              <w:top w:type="dxa" w:w="40"/>
-              <w:left w:type="dxa" w:w="70"/>
-              <w:bottom w:type="dxa" w:w="40"/>
-              <w:right w:type="dxa" w:w="70"/>
-            </w:tcMar>
-          </w:tcPr>
-          <w:p>
-            <w:pPr>
-              <w:jc w:val="left"/>
-            </w:pPr>
-            <w:r>
-              <w:rPr>
-                <w:rFonts w:ascii="Times New Roman" w:cs="Times New Roman" w:eastAsia="Times New Roman" w:hAnsi="Times New Roman"/>
-                <w:b w:val="false"/>
-                <w:bCs w:val="false"/>
-                <w:sz w:val="18"/>
-                <w:szCs w:val="18"/>
-              </w:rPr>
-              <w:t xml:space="preserve">NaCl mass fraction of the brine; lowers the water activity.</w:t>
-            </w:r>
-          </w:p>
-        </w:tc>
-        <w:tc>
-          <w:tcPr>
-            <w:tcBorders>
-              <w:top w:val="none" w:color="FFFFFF" w:sz="0"/>
-              <w:left w:val="none" w:color="FFFFFF" w:sz="0"/>
-              <w:bottom w:val="none" w:color="FFFFFF" w:sz="0"/>
-              <w:right w:val="none" w:color="FFFFFF" w:sz="0"/>
-            </w:tcBorders>
-            <w:tcMar>
-              <w:top w:type="dxa" w:w="40"/>
-              <w:left w:type="dxa" w:w="70"/>
-              <w:bottom w:type="dxa" w:w="40"/>
-              <w:right w:type="dxa" w:w="70"/>
-            </w:tcMar>
-          </w:tcPr>
-          <w:p>
-            <w:pPr>
-              <w:jc w:val="left"/>
-            </w:pPr>
-            <w:r>
-              <w:rPr>
-                <w:rFonts w:ascii="Times New Roman" w:cs="Times New Roman" w:eastAsia="Times New Roman" w:hAnsi="Times New Roman"/>
-                <w:b w:val="false"/>
-                <w:bCs w:val="false"/>
-                <w:sz w:val="18"/>
-                <w:szCs w:val="18"/>
-              </w:rPr>
-              <w:t xml:space="preserve">0 to 0.26</w:t>
-            </w:r>
-          </w:p>
-        </w:tc>
-      </w:tr>
-      <w:tr>
-        <w:trPr>
-          <w:cantSplit/>
-        </w:trPr>
-        <w:tc>
-          <w:tcPr>
-            <w:tcBorders>
-              <w:top w:val="none" w:color="FFFFFF" w:sz="0"/>
-              <w:left w:val="none" w:color="FFFFFF" w:sz="0"/>
-              <w:bottom w:val="none" w:color="FFFFFF" w:sz="0"/>
-              <w:right w:val="none" w:color="FFFFFF" w:sz="0"/>
-            </w:tcBorders>
-            <w:tcMar>
-              <w:top w:type="dxa" w:w="40"/>
-              <w:left w:type="dxa" w:w="70"/>
-              <w:bottom w:type="dxa" w:w="40"/>
-              <w:right w:type="dxa" w:w="70"/>
-            </w:tcMar>
-          </w:tcPr>
-          <w:p>
-            <w:pPr>
-              <w:jc w:val="left"/>
-            </w:pPr>
-            <w:r>
-              <w:rPr>
-                <w:rFonts w:ascii="Times New Roman" w:cs="Times New Roman" w:eastAsia="Times New Roman" w:hAnsi="Times New Roman"/>
-                <w:b w:val="false"/>
-                <w:bCs w:val="false"/>
-                <w:sz w:val="18"/>
-                <w:szCs w:val="18"/>
-              </w:rPr>
-              <w:t xml:space="preserve">Brine density</w:t>
-            </w:r>
-          </w:p>
-        </w:tc>
-        <w:tc>
-          <w:tcPr>
-            <w:tcBorders>
-              <w:top w:val="none" w:color="FFFFFF" w:sz="0"/>
-              <w:left w:val="none" w:color="FFFFFF" w:sz="0"/>
-              <w:bottom w:val="none" w:color="FFFFFF" w:sz="0"/>
-              <w:right w:val="none" w:color="FFFFFF" w:sz="0"/>
-            </w:tcBorders>
-            <w:tcMar>
-              <w:top w:type="dxa" w:w="40"/>
-              <w:left w:type="dxa" w:w="70"/>
-              <w:bottom w:type="dxa" w:w="40"/>
-              <w:right w:type="dxa" w:w="70"/>
-            </w:tcMar>
-          </w:tcPr>
-          <w:p>
-            <w:pPr>
-              <w:jc w:val="left"/>
-            </w:pPr>
-            <w:r>
-              <w:rPr>
-                <w:rFonts w:ascii="Times New Roman" w:cs="Times New Roman" w:eastAsia="Times New Roman" w:hAnsi="Times New Roman"/>
-                <w:b w:val="false"/>
-                <w:bCs w:val="false"/>
-                <w:sz w:val="18"/>
-                <w:szCs w:val="18"/>
-              </w:rPr>
-              <w:t xml:space="preserve">Density of the formation brine at reservoir conditions.</w:t>
-            </w:r>
-          </w:p>
-        </w:tc>
-        <w:tc>
-          <w:tcPr>
-            <w:tcBorders>
-              <w:top w:val="none" w:color="FFFFFF" w:sz="0"/>
-              <w:left w:val="none" w:color="FFFFFF" w:sz="0"/>
-              <w:bottom w:val="none" w:color="FFFFFF" w:sz="0"/>
-              <w:right w:val="none" w:color="FFFFFF" w:sz="0"/>
-            </w:tcBorders>
-            <w:tcMar>
-              <w:top w:type="dxa" w:w="40"/>
-              <w:left w:type="dxa" w:w="70"/>
-              <w:bottom w:type="dxa" w:w="40"/>
-              <w:right w:type="dxa" w:w="70"/>
-            </w:tcMar>
-          </w:tcPr>
-          <w:p>
-            <w:pPr>
-              <w:jc w:val="left"/>
-            </w:pPr>
-            <w:r>
-              <w:rPr>
-                <w:rFonts w:ascii="Times New Roman" w:cs="Times New Roman" w:eastAsia="Times New Roman" w:hAnsi="Times New Roman"/>
-                <w:b w:val="false"/>
-                <w:bCs w:val="false"/>
-                <w:sz w:val="18"/>
-                <w:szCs w:val="18"/>
-              </w:rPr>
-              <w:t xml:space="preserve">1000 to 1200 kg/m³</w:t>
-            </w:r>
-          </w:p>
-        </w:tc>
-      </w:tr>
-      <w:tr>
-        <w:trPr>
-          <w:cantSplit/>
-        </w:trPr>
-        <w:tc>
-          <w:tcPr>
-            <w:tcBorders>
-              <w:top w:val="none" w:color="FFFFFF" w:sz="0"/>
-              <w:left w:val="none" w:color="FFFFFF" w:sz="0"/>
-              <w:bottom w:val="single" w:color="111111" w:sz="8"/>
-              <w:right w:val="none" w:color="FFFFFF" w:sz="0"/>
-            </w:tcBorders>
-            <w:tcMar>
-              <w:top w:type="dxa" w:w="40"/>
-              <w:left w:type="dxa" w:w="70"/>
-              <w:bottom w:type="dxa" w:w="40"/>
-              <w:right w:type="dxa" w:w="70"/>
-            </w:tcMar>
-          </w:tcPr>
-          <w:p>
-            <w:pPr>
-              <w:jc w:val="left"/>
-            </w:pPr>
-            <w:r>
-              <w:rPr>
-                <w:rFonts w:ascii="Times New Roman" w:cs="Times New Roman" w:eastAsia="Times New Roman" w:hAnsi="Times New Roman"/>
-                <w:b w:val="false"/>
-                <w:bCs w:val="false"/>
-                <w:sz w:val="18"/>
-                <w:szCs w:val="18"/>
-              </w:rPr>
-              <w:t xml:space="preserve">Water fugacity coeff. Φw</w:t>
-            </w:r>
-          </w:p>
-        </w:tc>
-        <w:tc>
-          <w:tcPr>
-            <w:tcBorders>
-              <w:top w:val="none" w:color="FFFFFF" w:sz="0"/>
-              <w:left w:val="none" w:color="FFFFFF" w:sz="0"/>
-              <w:bottom w:val="single" w:color="111111" w:sz="8"/>
-              <w:right w:val="none" w:color="FFFFFF" w:sz="0"/>
-            </w:tcBorders>
-            <w:tcMar>
-              <w:top w:type="dxa" w:w="40"/>
-              <w:left w:type="dxa" w:w="70"/>
-              <w:bottom w:type="dxa" w:w="40"/>
-              <w:right w:type="dxa" w:w="70"/>
-            </w:tcMar>
-          </w:tcPr>
-          <w:p>
-            <w:pPr>
-              <w:jc w:val="left"/>
-            </w:pPr>
-            <w:r>
-              <w:rPr>
-                <w:rFonts w:ascii="Times New Roman" w:cs="Times New Roman" w:eastAsia="Times New Roman" w:hAnsi="Times New Roman"/>
-                <w:b w:val="false"/>
-                <w:bCs w:val="false"/>
-                <w:sz w:val="18"/>
-                <w:szCs w:val="18"/>
-              </w:rPr>
-              <w:t xml:space="preserve">Fugacity coefficient of water in the CO₂-rich phase. 1 is the screening approximation; smaller values mean the CO₂ carries more water and the dry zone is larger.</w:t>
-            </w:r>
-          </w:p>
-        </w:tc>
-        <w:tc>
-          <w:tcPr>
-            <w:tcBorders>
-              <w:top w:val="none" w:color="FFFFFF" w:sz="0"/>
-              <w:left w:val="none" w:color="FFFFFF" w:sz="0"/>
-              <w:bottom w:val="single" w:color="111111" w:sz="8"/>
-              <w:right w:val="none" w:color="FFFFFF" w:sz="0"/>
-            </w:tcBorders>
-            <w:tcMar>
-              <w:top w:type="dxa" w:w="40"/>
-              <w:left w:type="dxa" w:w="70"/>
-              <w:bottom w:type="dxa" w:w="40"/>
-              <w:right w:type="dxa" w:w="70"/>
-            </w:tcMar>
-          </w:tcPr>
-          <w:p>
-            <w:pPr>
-              <w:jc w:val="left"/>
-            </w:pPr>
-            <w:r>
-              <w:rPr>
-                <w:rFonts w:ascii="Times New Roman" w:cs="Times New Roman" w:eastAsia="Times New Roman" w:hAnsi="Times New Roman"/>
-                <w:b w:val="false"/>
-                <w:bCs w:val="false"/>
-                <w:sz w:val="18"/>
-                <w:szCs w:val="18"/>
-              </w:rPr>
-              <w:t xml:space="preserve">0.2 to 1</w:t>
             </w:r>
           </w:p>
         </w:tc>
@@ -4740,7 +4740,7 @@
           <w:sz w:val="17"/>
           <w:szCs w:val="17"/>
         </w:rPr>
-        <w:t xml:space="preserve">The defaults are illustrative; replace them with values for your formation (for example from core measurements and fluid properties).</w:t>
+        <w:t xml:space="preserve">The defaults are illustrative; replace them with values for your formation (for example from core measurements). The temperature, salinity, brine density and Φw listed in Table 2 also feed the dry-zone radius shown with the saturation results.</w:t>
       </w:r>
     </w:p>
     <w:p>
@@ -5035,7 +5035,7 @@
       <w:r>
         <w:drawing>
           <wp:inline distT="0" distB="0" distL="0" distR="0">
-            <wp:extent cx="4600575" cy="4000500"/>
+            <wp:extent cx="4591050" cy="4000500"/>
             <wp:effectExtent t="0" r="0" b="0" l="0"/>
             <wp:docPr id="4" name="figure" descr="Figure 4. The Injection wells section." title="Figure 4. The Injection wells section."/>
             <wp:cNvGraphicFramePr>
@@ -5060,7 +5060,7 @@
                   <pic:spPr bwMode="auto">
                     <a:xfrm>
                       <a:off x="0" y="0"/>
-                      <a:ext cx="4600575" cy="4000500"/>
+                      <a:ext cx="4591050" cy="4000500"/>
                     </a:xfrm>
                     <a:prstGeom prst="rect">
                       <a:avLst/>
@@ -5843,7 +5843,7 @@
       <w:r>
         <w:drawing>
           <wp:inline distT="0" distB="0" distL="0" distR="0">
-            <wp:extent cx="4076700" cy="4000500"/>
+            <wp:extent cx="4067175" cy="4000500"/>
             <wp:effectExtent t="0" r="0" b="0" l="0"/>
             <wp:docPr id="5" name="figure" descr="Figure 5. The wells table in longitude / latitude mode." title="Figure 5. The wells table in longitude / latitude mode."/>
             <wp:cNvGraphicFramePr>
@@ -5868,7 +5868,7 @@
                   <pic:spPr bwMode="auto">
                     <a:xfrm>
                       <a:off x="0" y="0"/>
-                      <a:ext cx="4076700" cy="4000500"/>
+                      <a:ext cx="4067175" cy="4000500"/>
                     </a:xfrm>
                     <a:prstGeom prst="rect">
                       <a:avLst/>

</xml_diff>

<commit_message>
Show the diffusivity of each zone (live); fix inputs rewriting small typed values
Co-Authored-By: Claude Sonnet 5.5 <noreply@anthropic.com>
</commit_message>
<xml_diff>
--- a/public/manual/user-manual.docx
+++ b/public/manual/user-manual.docx
@@ -1317,7 +1317,7 @@
       <w:r>
         <w:drawing>
           <wp:inline distT="0" distB="0" distL="0" distR="0">
-            <wp:extent cx="3743325" cy="4000500"/>
+            <wp:extent cx="3209925" cy="4000500"/>
             <wp:effectExtent t="0" r="0" b="0" l="0"/>
             <wp:docPr id="2" name="figure" descr="Figure 2. The Input section with a unit selector beside every value." title="Figure 2. The Input section with a unit selector beside every value."/>
             <wp:cNvGraphicFramePr>
@@ -1342,7 +1342,7 @@
                   <pic:spPr bwMode="auto">
                     <a:xfrm>
                       <a:off x="0" y="0"/>
-                      <a:ext cx="3743325" cy="4000500"/>
+                      <a:ext cx="3209925" cy="4000500"/>
                     </a:xfrm>
                     <a:prstGeom prst="rect">
                       <a:avLst/>
@@ -2365,38 +2365,38 @@
                 <w:sz w:val="18"/>
                 <w:szCs w:val="18"/>
               </w:rPr>
-              <w:t xml:space="preserve">Shown read-only under the inputs and calculated as k / (φ μ ct); it updates as soon as you change permeability, porosity, viscosity or compressibility. Only its display unit can be chosen.</w:t>
-            </w:r>
-          </w:p>
-        </w:tc>
-        <w:tc>
-          <w:tcPr>
-            <w:tcBorders>
-              <w:top w:val="none" w:color="FFFFFF" w:sz="0"/>
-              <w:left w:val="none" w:color="FFFFFF" w:sz="0"/>
-              <w:bottom w:val="none" w:color="FFFFFF" w:sz="0"/>
-              <w:right w:val="none" w:color="FFFFFF" w:sz="0"/>
-            </w:tcBorders>
-            <w:tcMar>
-              <w:top w:type="dxa" w:w="40"/>
-              <w:left w:type="dxa" w:w="70"/>
-              <w:bottom w:type="dxa" w:w="40"/>
-              <w:right w:type="dxa" w:w="70"/>
-            </w:tcMar>
-          </w:tcPr>
-          <w:p>
-            <w:pPr>
-              <w:jc w:val="left"/>
-            </w:pPr>
-            <w:r>
-              <w:rPr>
-                <w:rFonts w:ascii="Times New Roman" w:cs="Times New Roman" w:eastAsia="Times New Roman" w:hAnsi="Times New Roman"/>
-                <w:b w:val="false"/>
-                <w:bCs w:val="false"/>
-                <w:sz w:val="18"/>
-                <w:szCs w:val="18"/>
-              </w:rPr>
-              <w:t xml:space="preserve">0.1 to 10 m²/s</w:t>
+              <w:t xml:space="preserve">Shown read-only under the inputs. With the three-zone pressure model it is shown for each zone (dry CO₂, CO₂ + brine, brine) as η × m / c*, and with the single-phase model as k / (φ μ ct). It updates as soon as you change any input; only its display unit can be chosen.</w:t>
+            </w:r>
+          </w:p>
+        </w:tc>
+        <w:tc>
+          <w:tcPr>
+            <w:tcBorders>
+              <w:top w:val="none" w:color="FFFFFF" w:sz="0"/>
+              <w:left w:val="none" w:color="FFFFFF" w:sz="0"/>
+              <w:bottom w:val="none" w:color="FFFFFF" w:sz="0"/>
+              <w:right w:val="none" w:color="FFFFFF" w:sz="0"/>
+            </w:tcBorders>
+            <w:tcMar>
+              <w:top w:type="dxa" w:w="40"/>
+              <w:left w:type="dxa" w:w="70"/>
+              <w:bottom w:type="dxa" w:w="40"/>
+              <w:right w:type="dxa" w:w="70"/>
+            </w:tcMar>
+          </w:tcPr>
+          <w:p>
+            <w:pPr>
+              <w:jc w:val="left"/>
+            </w:pPr>
+            <w:r>
+              <w:rPr>
+                <w:rFonts w:ascii="Times New Roman" w:cs="Times New Roman" w:eastAsia="Times New Roman" w:hAnsi="Times New Roman"/>
+                <w:b w:val="false"/>
+                <w:bCs w:val="false"/>
+                <w:sz w:val="18"/>
+                <w:szCs w:val="18"/>
+              </w:rPr>
+              <w:t xml:space="preserve">brine 0.1 to 10 m²/s</w:t>
             </w:r>
           </w:p>
         </w:tc>

</xml_diff>

<commit_message>
Pressure map style options: colour scales, colour bands, contour lines with labels, streamlines
Co-Authored-By: Claude Sonnet 5.5 <noreply@anthropic.com>
</commit_message>
<xml_diff>
--- a/public/manual/user-manual.docx
+++ b/public/manual/user-manual.docx
@@ -6287,20 +6287,525 @@
     </w:p>
     <w:p>
       <w:pPr>
-        <w:pStyle w:val="Heading2"/>
+        <w:spacing w:after="120" w:line="276"/>
+        <w:jc w:val="both"/>
+      </w:pPr>
+      <w:r>
+        <w:rPr>
+          <w:rFonts w:ascii="Times New Roman" w:cs="Times New Roman" w:eastAsia="Times New Roman" w:hAnsi="Times New Roman"/>
+          <w:sz w:val="22"/>
+          <w:szCs w:val="22"/>
+        </w:rPr>
+        <w:t xml:space="preserve">Above the pressure map, the style bar controls how the map is coloured and annotated. The choices apply to the picture, to the PNG and SVG exports and to the report figure.</w:t>
+      </w:r>
+    </w:p>
+    <w:p>
+      <w:pPr>
         <w:keepNext/>
-        <w:spacing w:after="60" w:before="160"/>
+        <w:spacing w:after="60" w:before="120"/>
       </w:pPr>
       <w:r>
         <w:rPr>
           <w:rFonts w:ascii="Times New Roman" w:cs="Times New Roman" w:eastAsia="Times New Roman" w:hAnsi="Times New Roman"/>
           <w:b/>
           <w:bCs/>
-          <w:sz w:val="22"/>
-          <w:szCs w:val="22"/>
-        </w:rPr>
-        <w:t xml:space="preserve">6.4 Time series tab</w:t>
-      </w:r>
+          <w:sz w:val="20"/>
+          <w:szCs w:val="20"/>
+        </w:rPr>
+        <w:t xml:space="preserve">Table 5a. Map style options (pressure map).</w:t>
+      </w:r>
+    </w:p>
+    <w:tbl>
+      <w:tblPr>
+        <w:tblW w:type="pct" w:w="5000"/>
+        <w:tblBorders>
+          <w:top w:val="none" w:color="FFFFFF" w:sz="0"/>
+          <w:left w:val="none" w:color="FFFFFF" w:sz="0"/>
+          <w:bottom w:val="none" w:color="FFFFFF" w:sz="0"/>
+          <w:right w:val="none" w:color="FFFFFF" w:sz="0"/>
+          <w:insideH w:val="none" w:color="FFFFFF" w:sz="0"/>
+          <w:insideV w:val="none" w:color="FFFFFF" w:sz="0"/>
+        </w:tblBorders>
+      </w:tblPr>
+      <w:tblGrid>
+        <w:gridCol w:w="4536"/>
+        <w:gridCol w:w="4536"/>
+      </w:tblGrid>
+      <w:tr>
+        <w:trPr>
+          <w:cantSplit/>
+          <w:tblHeader/>
+        </w:trPr>
+        <w:tc>
+          <w:tcPr>
+            <w:tcBorders>
+              <w:top w:val="single" w:color="111111" w:sz="8"/>
+              <w:left w:val="none" w:color="FFFFFF" w:sz="0"/>
+              <w:bottom w:val="single" w:color="111111" w:sz="4"/>
+              <w:right w:val="none" w:color="FFFFFF" w:sz="0"/>
+            </w:tcBorders>
+            <w:tcMar>
+              <w:top w:type="dxa" w:w="40"/>
+              <w:left w:type="dxa" w:w="70"/>
+              <w:bottom w:type="dxa" w:w="40"/>
+              <w:right w:type="dxa" w:w="70"/>
+            </w:tcMar>
+          </w:tcPr>
+          <w:p>
+            <w:pPr>
+              <w:jc w:val="left"/>
+            </w:pPr>
+            <w:r>
+              <w:rPr>
+                <w:rFonts w:ascii="Times New Roman" w:cs="Times New Roman" w:eastAsia="Times New Roman" w:hAnsi="Times New Roman"/>
+                <w:b/>
+                <w:bCs/>
+                <w:sz w:val="18"/>
+                <w:szCs w:val="18"/>
+              </w:rPr>
+              <w:t xml:space="preserve">Option</w:t>
+            </w:r>
+          </w:p>
+        </w:tc>
+        <w:tc>
+          <w:tcPr>
+            <w:tcBorders>
+              <w:top w:val="single" w:color="111111" w:sz="8"/>
+              <w:left w:val="none" w:color="FFFFFF" w:sz="0"/>
+              <w:bottom w:val="single" w:color="111111" w:sz="4"/>
+              <w:right w:val="none" w:color="FFFFFF" w:sz="0"/>
+            </w:tcBorders>
+            <w:tcMar>
+              <w:top w:type="dxa" w:w="40"/>
+              <w:left w:type="dxa" w:w="70"/>
+              <w:bottom w:type="dxa" w:w="40"/>
+              <w:right w:type="dxa" w:w="70"/>
+            </w:tcMar>
+          </w:tcPr>
+          <w:p>
+            <w:pPr>
+              <w:jc w:val="left"/>
+            </w:pPr>
+            <w:r>
+              <w:rPr>
+                <w:rFonts w:ascii="Times New Roman" w:cs="Times New Roman" w:eastAsia="Times New Roman" w:hAnsi="Times New Roman"/>
+                <w:b/>
+                <w:bCs/>
+                <w:sz w:val="18"/>
+                <w:szCs w:val="18"/>
+              </w:rPr>
+              <w:t xml:space="preserve">What it does</w:t>
+            </w:r>
+          </w:p>
+        </w:tc>
+      </w:tr>
+      <w:tr>
+        <w:trPr>
+          <w:cantSplit/>
+        </w:trPr>
+        <w:tc>
+          <w:tcPr>
+            <w:tcBorders>
+              <w:top w:val="none" w:color="FFFFFF" w:sz="0"/>
+              <w:left w:val="none" w:color="FFFFFF" w:sz="0"/>
+              <w:bottom w:val="none" w:color="FFFFFF" w:sz="0"/>
+              <w:right w:val="none" w:color="FFFFFF" w:sz="0"/>
+            </w:tcBorders>
+            <w:tcMar>
+              <w:top w:type="dxa" w:w="40"/>
+              <w:left w:type="dxa" w:w="70"/>
+              <w:bottom w:type="dxa" w:w="40"/>
+              <w:right w:type="dxa" w:w="70"/>
+            </w:tcMar>
+          </w:tcPr>
+          <w:p>
+            <w:pPr>
+              <w:jc w:val="left"/>
+            </w:pPr>
+            <w:r>
+              <w:rPr>
+                <w:rFonts w:ascii="Times New Roman" w:cs="Times New Roman" w:eastAsia="Times New Roman" w:hAnsi="Times New Roman"/>
+                <w:b w:val="false"/>
+                <w:bCs w:val="false"/>
+                <w:sz w:val="18"/>
+                <w:szCs w:val="18"/>
+              </w:rPr>
+              <w:t xml:space="preserve">Colour scale</w:t>
+            </w:r>
+          </w:p>
+        </w:tc>
+        <w:tc>
+          <w:tcPr>
+            <w:tcBorders>
+              <w:top w:val="none" w:color="FFFFFF" w:sz="0"/>
+              <w:left w:val="none" w:color="FFFFFF" w:sz="0"/>
+              <w:bottom w:val="none" w:color="FFFFFF" w:sz="0"/>
+              <w:right w:val="none" w:color="FFFFFF" w:sz="0"/>
+            </w:tcBorders>
+            <w:tcMar>
+              <w:top w:type="dxa" w:w="40"/>
+              <w:left w:type="dxa" w:w="70"/>
+              <w:bottom w:type="dxa" w:w="40"/>
+              <w:right w:type="dxa" w:w="70"/>
+            </w:tcMar>
+          </w:tcPr>
+          <w:p>
+            <w:pPr>
+              <w:jc w:val="left"/>
+            </w:pPr>
+            <w:r>
+              <w:rPr>
+                <w:rFonts w:ascii="Times New Roman" w:cs="Times New Roman" w:eastAsia="Times New Roman" w:hAnsi="Times New Roman"/>
+                <w:b w:val="false"/>
+                <w:bCs w:val="false"/>
+                <w:sz w:val="18"/>
+                <w:szCs w:val="18"/>
+              </w:rPr>
+              <w:t xml:space="preserve">Sunset (default), Jet, Turbo, Viridis, Plasma, Blues, Cool–warm (diverging) or Greyscale. The colour bar and its numbers follow the choice.</w:t>
+            </w:r>
+          </w:p>
+        </w:tc>
+      </w:tr>
+      <w:tr>
+        <w:trPr>
+          <w:cantSplit/>
+        </w:trPr>
+        <w:tc>
+          <w:tcPr>
+            <w:tcBorders>
+              <w:top w:val="none" w:color="FFFFFF" w:sz="0"/>
+              <w:left w:val="none" w:color="FFFFFF" w:sz="0"/>
+              <w:bottom w:val="none" w:color="FFFFFF" w:sz="0"/>
+              <w:right w:val="none" w:color="FFFFFF" w:sz="0"/>
+            </w:tcBorders>
+            <w:tcMar>
+              <w:top w:type="dxa" w:w="40"/>
+              <w:left w:type="dxa" w:w="70"/>
+              <w:bottom w:type="dxa" w:w="40"/>
+              <w:right w:type="dxa" w:w="70"/>
+            </w:tcMar>
+          </w:tcPr>
+          <w:p>
+            <w:pPr>
+              <w:jc w:val="left"/>
+            </w:pPr>
+            <w:r>
+              <w:rPr>
+                <w:rFonts w:ascii="Times New Roman" w:cs="Times New Roman" w:eastAsia="Times New Roman" w:hAnsi="Times New Roman"/>
+                <w:b w:val="false"/>
+                <w:bCs w:val="false"/>
+                <w:sz w:val="18"/>
+                <w:szCs w:val="18"/>
+              </w:rPr>
+              <w:t xml:space="preserve">Fill</w:t>
+            </w:r>
+          </w:p>
+        </w:tc>
+        <w:tc>
+          <w:tcPr>
+            <w:tcBorders>
+              <w:top w:val="none" w:color="FFFFFF" w:sz="0"/>
+              <w:left w:val="none" w:color="FFFFFF" w:sz="0"/>
+              <w:bottom w:val="none" w:color="FFFFFF" w:sz="0"/>
+              <w:right w:val="none" w:color="FFFFFF" w:sz="0"/>
+            </w:tcBorders>
+            <w:tcMar>
+              <w:top w:type="dxa" w:w="40"/>
+              <w:left w:type="dxa" w:w="70"/>
+              <w:bottom w:type="dxa" w:w="40"/>
+              <w:right w:type="dxa" w:w="70"/>
+            </w:tcMar>
+          </w:tcPr>
+          <w:p>
+            <w:pPr>
+              <w:jc w:val="left"/>
+            </w:pPr>
+            <w:r>
+              <w:rPr>
+                <w:rFonts w:ascii="Times New Roman" w:cs="Times New Roman" w:eastAsia="Times New Roman" w:hAnsi="Times New Roman"/>
+                <w:b w:val="false"/>
+                <w:bCs w:val="false"/>
+                <w:sz w:val="18"/>
+                <w:szCs w:val="18"/>
+              </w:rPr>
+              <w:t xml:space="preserve">Smooth colours, Colour bands (the pressure is grouped into the chosen number of classes with a stepped colour bar) or No fill (white map, useful with contour lines).</w:t>
+            </w:r>
+          </w:p>
+        </w:tc>
+      </w:tr>
+      <w:tr>
+        <w:trPr>
+          <w:cantSplit/>
+        </w:trPr>
+        <w:tc>
+          <w:tcPr>
+            <w:tcBorders>
+              <w:top w:val="none" w:color="FFFFFF" w:sz="0"/>
+              <w:left w:val="none" w:color="FFFFFF" w:sz="0"/>
+              <w:bottom w:val="none" w:color="FFFFFF" w:sz="0"/>
+              <w:right w:val="none" w:color="FFFFFF" w:sz="0"/>
+            </w:tcBorders>
+            <w:tcMar>
+              <w:top w:type="dxa" w:w="40"/>
+              <w:left w:type="dxa" w:w="70"/>
+              <w:bottom w:type="dxa" w:w="40"/>
+              <w:right w:type="dxa" w:w="70"/>
+            </w:tcMar>
+          </w:tcPr>
+          <w:p>
+            <w:pPr>
+              <w:jc w:val="left"/>
+            </w:pPr>
+            <w:r>
+              <w:rPr>
+                <w:rFonts w:ascii="Times New Roman" w:cs="Times New Roman" w:eastAsia="Times New Roman" w:hAnsi="Times New Roman"/>
+                <w:b w:val="false"/>
+                <w:bCs w:val="false"/>
+                <w:sz w:val="18"/>
+                <w:szCs w:val="18"/>
+              </w:rPr>
+              <w:t xml:space="preserve">Reverse colours</w:t>
+            </w:r>
+          </w:p>
+        </w:tc>
+        <w:tc>
+          <w:tcPr>
+            <w:tcBorders>
+              <w:top w:val="none" w:color="FFFFFF" w:sz="0"/>
+              <w:left w:val="none" w:color="FFFFFF" w:sz="0"/>
+              <w:bottom w:val="none" w:color="FFFFFF" w:sz="0"/>
+              <w:right w:val="none" w:color="FFFFFF" w:sz="0"/>
+            </w:tcBorders>
+            <w:tcMar>
+              <w:top w:type="dxa" w:w="40"/>
+              <w:left w:type="dxa" w:w="70"/>
+              <w:bottom w:type="dxa" w:w="40"/>
+              <w:right w:type="dxa" w:w="70"/>
+            </w:tcMar>
+          </w:tcPr>
+          <w:p>
+            <w:pPr>
+              <w:jc w:val="left"/>
+            </w:pPr>
+            <w:r>
+              <w:rPr>
+                <w:rFonts w:ascii="Times New Roman" w:cs="Times New Roman" w:eastAsia="Times New Roman" w:hAnsi="Times New Roman"/>
+                <w:b w:val="false"/>
+                <w:bCs w:val="false"/>
+                <w:sz w:val="18"/>
+                <w:szCs w:val="18"/>
+              </w:rPr>
+              <w:t xml:space="preserve">Flips the colour scale so that high pressure takes the colour of low pressure and vice versa.</w:t>
+            </w:r>
+          </w:p>
+        </w:tc>
+      </w:tr>
+      <w:tr>
+        <w:trPr>
+          <w:cantSplit/>
+        </w:trPr>
+        <w:tc>
+          <w:tcPr>
+            <w:tcBorders>
+              <w:top w:val="none" w:color="FFFFFF" w:sz="0"/>
+              <w:left w:val="none" w:color="FFFFFF" w:sz="0"/>
+              <w:bottom w:val="none" w:color="FFFFFF" w:sz="0"/>
+              <w:right w:val="none" w:color="FFFFFF" w:sz="0"/>
+            </w:tcBorders>
+            <w:tcMar>
+              <w:top w:type="dxa" w:w="40"/>
+              <w:left w:type="dxa" w:w="70"/>
+              <w:bottom w:type="dxa" w:w="40"/>
+              <w:right w:type="dxa" w:w="70"/>
+            </w:tcMar>
+          </w:tcPr>
+          <w:p>
+            <w:pPr>
+              <w:jc w:val="left"/>
+            </w:pPr>
+            <w:r>
+              <w:rPr>
+                <w:rFonts w:ascii="Times New Roman" w:cs="Times New Roman" w:eastAsia="Times New Roman" w:hAnsi="Times New Roman"/>
+                <w:b w:val="false"/>
+                <w:bCs w:val="false"/>
+                <w:sz w:val="18"/>
+                <w:szCs w:val="18"/>
+              </w:rPr>
+              <w:t xml:space="preserve">Contour lines</w:t>
+            </w:r>
+          </w:p>
+        </w:tc>
+        <w:tc>
+          <w:tcPr>
+            <w:tcBorders>
+              <w:top w:val="none" w:color="FFFFFF" w:sz="0"/>
+              <w:left w:val="none" w:color="FFFFFF" w:sz="0"/>
+              <w:bottom w:val="none" w:color="FFFFFF" w:sz="0"/>
+              <w:right w:val="none" w:color="FFFFFF" w:sz="0"/>
+            </w:tcBorders>
+            <w:tcMar>
+              <w:top w:type="dxa" w:w="40"/>
+              <w:left w:type="dxa" w:w="70"/>
+              <w:bottom w:type="dxa" w:w="40"/>
+              <w:right w:type="dxa" w:w="70"/>
+            </w:tcMar>
+          </w:tcPr>
+          <w:p>
+            <w:pPr>
+              <w:jc w:val="left"/>
+            </w:pPr>
+            <w:r>
+              <w:rPr>
+                <w:rFonts w:ascii="Times New Roman" w:cs="Times New Roman" w:eastAsia="Times New Roman" w:hAnsi="Times New Roman"/>
+                <w:b w:val="false"/>
+                <w:bCs w:val="false"/>
+                <w:sz w:val="18"/>
+                <w:szCs w:val="18"/>
+              </w:rPr>
+              <w:t xml:space="preserve">Draws iso-pressure lines at round values (5, 8, 10, 15 or 20 levels) with the value written on each line; Labels turns the numbers off.</w:t>
+            </w:r>
+          </w:p>
+        </w:tc>
+      </w:tr>
+      <w:tr>
+        <w:trPr>
+          <w:cantSplit/>
+        </w:trPr>
+        <w:tc>
+          <w:tcPr>
+            <w:tcBorders>
+              <w:top w:val="none" w:color="FFFFFF" w:sz="0"/>
+              <w:left w:val="none" w:color="FFFFFF" w:sz="0"/>
+              <w:bottom w:val="none" w:color="FFFFFF" w:sz="0"/>
+              <w:right w:val="none" w:color="FFFFFF" w:sz="0"/>
+            </w:tcBorders>
+            <w:tcMar>
+              <w:top w:type="dxa" w:w="40"/>
+              <w:left w:type="dxa" w:w="70"/>
+              <w:bottom w:type="dxa" w:w="40"/>
+              <w:right w:type="dxa" w:w="70"/>
+            </w:tcMar>
+          </w:tcPr>
+          <w:p>
+            <w:pPr>
+              <w:jc w:val="left"/>
+            </w:pPr>
+            <w:r>
+              <w:rPr>
+                <w:rFonts w:ascii="Times New Roman" w:cs="Times New Roman" w:eastAsia="Times New Roman" w:hAnsi="Times New Roman"/>
+                <w:b w:val="false"/>
+                <w:bCs w:val="false"/>
+                <w:sz w:val="18"/>
+                <w:szCs w:val="18"/>
+              </w:rPr>
+              <w:t xml:space="preserve">Streamlines</w:t>
+            </w:r>
+          </w:p>
+        </w:tc>
+        <w:tc>
+          <w:tcPr>
+            <w:tcBorders>
+              <w:top w:val="none" w:color="FFFFFF" w:sz="0"/>
+              <w:left w:val="none" w:color="FFFFFF" w:sz="0"/>
+              <w:bottom w:val="none" w:color="FFFFFF" w:sz="0"/>
+              <w:right w:val="none" w:color="FFFFFF" w:sz="0"/>
+            </w:tcBorders>
+            <w:tcMar>
+              <w:top w:type="dxa" w:w="40"/>
+              <w:left w:type="dxa" w:w="70"/>
+              <w:bottom w:type="dxa" w:w="40"/>
+              <w:right w:type="dxa" w:w="70"/>
+            </w:tcMar>
+          </w:tcPr>
+          <w:p>
+            <w:pPr>
+              <w:jc w:val="left"/>
+            </w:pPr>
+            <w:r>
+              <w:rPr>
+                <w:rFonts w:ascii="Times New Roman" w:cs="Times New Roman" w:eastAsia="Times New Roman" w:hAnsi="Times New Roman"/>
+                <w:b w:val="false"/>
+                <w:bCs w:val="false"/>
+                <w:sz w:val="18"/>
+                <w:szCs w:val="18"/>
+              </w:rPr>
+              <w:t xml:space="preserve">Draws the flow paths of the brine (down the pressure gradient, away from the injectors), with an arrow showing the direction. They bend around the wells and are pushed away from a sealing boundary.</w:t>
+            </w:r>
+          </w:p>
+        </w:tc>
+      </w:tr>
+      <w:tr>
+        <w:trPr>
+          <w:cantSplit/>
+        </w:trPr>
+        <w:tc>
+          <w:tcPr>
+            <w:tcBorders>
+              <w:top w:val="none" w:color="FFFFFF" w:sz="0"/>
+              <w:left w:val="none" w:color="FFFFFF" w:sz="0"/>
+              <w:bottom w:val="single" w:color="111111" w:sz="8"/>
+              <w:right w:val="none" w:color="FFFFFF" w:sz="0"/>
+            </w:tcBorders>
+            <w:tcMar>
+              <w:top w:type="dxa" w:w="40"/>
+              <w:left w:type="dxa" w:w="70"/>
+              <w:bottom w:type="dxa" w:w="40"/>
+              <w:right w:type="dxa" w:w="70"/>
+            </w:tcMar>
+          </w:tcPr>
+          <w:p>
+            <w:pPr>
+              <w:jc w:val="left"/>
+            </w:pPr>
+            <w:r>
+              <w:rPr>
+                <w:rFonts w:ascii="Times New Roman" w:cs="Times New Roman" w:eastAsia="Times New Roman" w:hAnsi="Times New Roman"/>
+                <w:b w:val="false"/>
+                <w:bCs w:val="false"/>
+                <w:sz w:val="18"/>
+                <w:szCs w:val="18"/>
+              </w:rPr>
+              <w:t xml:space="preserve">Reset style</w:t>
+            </w:r>
+          </w:p>
+        </w:tc>
+        <w:tc>
+          <w:tcPr>
+            <w:tcBorders>
+              <w:top w:val="none" w:color="FFFFFF" w:sz="0"/>
+              <w:left w:val="none" w:color="FFFFFF" w:sz="0"/>
+              <w:bottom w:val="single" w:color="111111" w:sz="8"/>
+              <w:right w:val="none" w:color="FFFFFF" w:sz="0"/>
+            </w:tcBorders>
+            <w:tcMar>
+              <w:top w:type="dxa" w:w="40"/>
+              <w:left w:type="dxa" w:w="70"/>
+              <w:bottom w:type="dxa" w:w="40"/>
+              <w:right w:type="dxa" w:w="70"/>
+            </w:tcMar>
+          </w:tcPr>
+          <w:p>
+            <w:pPr>
+              <w:jc w:val="left"/>
+            </w:pPr>
+            <w:r>
+              <w:rPr>
+                <w:rFonts w:ascii="Times New Roman" w:cs="Times New Roman" w:eastAsia="Times New Roman" w:hAnsi="Times New Roman"/>
+                <w:b w:val="false"/>
+                <w:bCs w:val="false"/>
+                <w:sz w:val="18"/>
+                <w:szCs w:val="18"/>
+              </w:rPr>
+              <w:t xml:space="preserve">Returns to the default colours.</w:t>
+            </w:r>
+          </w:p>
+        </w:tc>
+      </w:tr>
+    </w:tbl>
+    <w:p>
+      <w:pPr>
+        <w:spacing w:after="100"/>
+      </w:pPr>
     </w:p>
     <w:p>
       <w:pPr>
@@ -6311,9 +6816,9 @@
       <w:r>
         <w:drawing>
           <wp:inline distT="0" distB="0" distL="0" distR="0">
-            <wp:extent cx="5334000" cy="2943225"/>
+            <wp:extent cx="4857750" cy="4000500"/>
             <wp:effectExtent t="0" r="0" b="0" l="0"/>
-            <wp:docPr id="8" name="figure" descr="Figure 8. Time series of pressure at every well and monitoring point, with the field maximum and average." title="Figure 8. Time series of pressure at every well and monitoring point, with the field maximum and average."/>
+            <wp:docPr id="8" name="figure" descr="Figure 7a. The pressure map with the Viridis scale, colour bands, contour lines and streamlines." title="Figure 7a. The pressure map with the Viridis scale, colour bands, contour lines and streamlines."/>
             <wp:cNvGraphicFramePr>
               <a:graphicFrameLocks xmlns:a="http://schemas.openxmlformats.org/drawingml/2006/main" noChangeAspect="1"/>
             </wp:cNvGraphicFramePr>
@@ -6336,7 +6841,7 @@
                   <pic:spPr bwMode="auto">
                     <a:xfrm>
                       <a:off x="0" y="0"/>
-                      <a:ext cx="5334000" cy="2943225"/>
+                      <a:ext cx="4857750" cy="4000500"/>
                     </a:xfrm>
                     <a:prstGeom prst="rect">
                       <a:avLst/>
@@ -6361,35 +6866,7 @@
           <w:sz w:val="18"/>
           <w:szCs w:val="18"/>
         </w:rPr>
-        <w:t xml:space="preserve">Figure 8. Time series of pressure at every well and monitoring point, with the field maximum and average.</w:t>
-      </w:r>
-    </w:p>
-    <w:p>
-      <w:pPr>
-        <w:spacing w:after="120" w:line="276"/>
-        <w:jc w:val="both"/>
-      </w:pPr>
-      <w:r>
-        <w:rPr>
-          <w:rFonts w:ascii="Times New Roman" w:cs="Times New Roman" w:eastAsia="Times New Roman" w:hAnsi="Times New Roman"/>
-          <w:sz w:val="22"/>
-          <w:szCs w:val="22"/>
-        </w:rPr>
-        <w:t xml:space="preserve">The Show selector chooses what is plotted: total buildup (ΔP) at each wellbore including skin; bottomhole pressure (initial pressure plus buildup), with the maximum allowable bottomhole pressure; or interference only, which removes each well's own contribution so that only the effect of the other wells remains. Dashed lines are monitoring points. The black line is the field maximum (the highest pressure of any well at each time) and the grey dash-dot line is the field average.</w:t>
-      </w:r>
-    </w:p>
-    <w:p>
-      <w:pPr>
-        <w:spacing w:after="120" w:line="276"/>
-        <w:jc w:val="both"/>
-      </w:pPr>
-      <w:r>
-        <w:rPr>
-          <w:rFonts w:ascii="Times New Roman" w:cs="Times New Roman" w:eastAsia="Times New Roman" w:hAnsi="Times New Roman"/>
-          <w:sz w:val="22"/>
-          <w:szCs w:val="22"/>
-        </w:rPr>
-        <w:t xml:space="preserve">Under the chart, the section “What drives the field maximum” stacks the contributions of each injector and of skin at the well that has the highest pressure at each time, and a table gives the breakdown at the moment of the field peak.</w:t>
+        <w:t xml:space="preserve">Figure 7a. The pressure map with the Viridis scale, colour bands, contour lines and streamlines.</w:t>
       </w:r>
     </w:p>
     <w:p>
@@ -6406,7 +6883,7 @@
           <w:sz w:val="22"/>
           <w:szCs w:val="22"/>
         </w:rPr>
-        <w:t xml:space="preserve">6.5 Interference matrix tab</w:t>
+        <w:t xml:space="preserve">6.4 Time series tab</w:t>
       </w:r>
     </w:p>
     <w:p>
@@ -6418,9 +6895,9 @@
       <w:r>
         <w:drawing>
           <wp:inline distT="0" distB="0" distL="0" distR="0">
-            <wp:extent cx="5334000" cy="2667000"/>
+            <wp:extent cx="5334000" cy="2943225"/>
             <wp:effectExtent t="0" r="0" b="0" l="0"/>
-            <wp:docPr id="9" name="figure" descr="Figure 9. Interference matrix and arrival-time table." title="Figure 9. Interference matrix and arrival-time table."/>
+            <wp:docPr id="9" name="figure" descr="Figure 8. Time series of pressure at every well and monitoring point, with the field maximum and average." title="Figure 8. Time series of pressure at every well and monitoring point, with the field maximum and average."/>
             <wp:cNvGraphicFramePr>
               <a:graphicFrameLocks xmlns:a="http://schemas.openxmlformats.org/drawingml/2006/main" noChangeAspect="1"/>
             </wp:cNvGraphicFramePr>
@@ -6443,7 +6920,7 @@
                   <pic:spPr bwMode="auto">
                     <a:xfrm>
                       <a:off x="0" y="0"/>
-                      <a:ext cx="5334000" cy="2667000"/>
+                      <a:ext cx="5334000" cy="2943225"/>
                     </a:xfrm>
                     <a:prstGeom prst="rect">
                       <a:avLst/>
@@ -6468,7 +6945,7 @@
           <w:sz w:val="18"/>
           <w:szCs w:val="18"/>
         </w:rPr>
-        <w:t xml:space="preserve">Figure 9. Interference matrix and arrival-time table.</w:t>
+        <w:t xml:space="preserve">Figure 8. Time series of pressure at every well and monitoring point, with the field maximum and average.</w:t>
       </w:r>
     </w:p>
     <w:p>
@@ -6482,7 +6959,21 @@
           <w:sz w:val="22"/>
           <w:szCs w:val="22"/>
         </w:rPr>
-        <w:t xml:space="preserve">The first table has one row per injecting well and one column per receiving well. Each cell is the pressure that the row well contributes at the column well at the evaluation time; the diagonal cells are each well's own buildup including skin. The last column gives the total felt at other wells, and the last row the total at each receiver. The second table gives the first time (years) that a single source well alone raises the pressure at each target (wells and monitoring points) by the interference threshold; a dash means it does not happen during the injection period.</w:t>
+        <w:t xml:space="preserve">The Show selector chooses what is plotted: total buildup (ΔP) at each wellbore including skin; bottomhole pressure (initial pressure plus buildup), with the maximum allowable bottomhole pressure; or interference only, which removes each well's own contribution so that only the effect of the other wells remains. Dashed lines are monitoring points. The black line is the field maximum (the highest pressure of any well at each time) and the grey dash-dot line is the field average.</w:t>
+      </w:r>
+    </w:p>
+    <w:p>
+      <w:pPr>
+        <w:spacing w:after="120" w:line="276"/>
+        <w:jc w:val="both"/>
+      </w:pPr>
+      <w:r>
+        <w:rPr>
+          <w:rFonts w:ascii="Times New Roman" w:cs="Times New Roman" w:eastAsia="Times New Roman" w:hAnsi="Times New Roman"/>
+          <w:sz w:val="22"/>
+          <w:szCs w:val="22"/>
+        </w:rPr>
+        <w:t xml:space="preserve">Under the chart, the section “What drives the field maximum” stacks the contributions of each injector and of skin at the well that has the highest pressure at each time, and a table gives the breakdown at the moment of the field peak.</w:t>
       </w:r>
     </w:p>
     <w:p>
@@ -6499,7 +6990,7 @@
           <w:sz w:val="22"/>
           <w:szCs w:val="22"/>
         </w:rPr>
-        <w:t xml:space="preserve">6.6 Limit check tab</w:t>
+        <w:t xml:space="preserve">6.5 Interference matrix tab</w:t>
       </w:r>
     </w:p>
     <w:p>
@@ -6511,9 +7002,9 @@
       <w:r>
         <w:drawing>
           <wp:inline distT="0" distB="0" distL="0" distR="0">
-            <wp:extent cx="5334000" cy="1838325"/>
+            <wp:extent cx="5334000" cy="2667000"/>
             <wp:effectExtent t="0" r="0" b="0" l="0"/>
-            <wp:docPr id="10" name="figure" descr="Figure 10. Limit check for each well and the monitoring-point table." title="Figure 10. Limit check for each well and the monitoring-point table."/>
+            <wp:docPr id="10" name="figure" descr="Figure 9. Interference matrix and arrival-time table." title="Figure 9. Interference matrix and arrival-time table."/>
             <wp:cNvGraphicFramePr>
               <a:graphicFrameLocks xmlns:a="http://schemas.openxmlformats.org/drawingml/2006/main" noChangeAspect="1"/>
             </wp:cNvGraphicFramePr>
@@ -6536,7 +7027,7 @@
                   <pic:spPr bwMode="auto">
                     <a:xfrm>
                       <a:off x="0" y="0"/>
-                      <a:ext cx="5334000" cy="1838325"/>
+                      <a:ext cx="5334000" cy="2667000"/>
                     </a:xfrm>
                     <a:prstGeom prst="rect">
                       <a:avLst/>
@@ -6561,7 +7052,7 @@
           <w:sz w:val="18"/>
           <w:szCs w:val="18"/>
         </w:rPr>
-        <w:t xml:space="preserve">Figure 10. Limit check for each well and the monitoring-point table.</w:t>
+        <w:t xml:space="preserve">Figure 9. Interference matrix and arrival-time table.</w:t>
       </w:r>
     </w:p>
     <w:p>
@@ -6575,7 +7066,7 @@
           <w:sz w:val="22"/>
           <w:szCs w:val="22"/>
         </w:rPr>
-        <w:t xml:space="preserve">Each well is listed with its peak buildup, the time of the peak and how that peak splits into the well's own response, skin and interference from the other wells. The bottomhole pressure, the margin to the allowable buildup and an OK or Exceeds status follow. Below, the monitoring-point table shows the peak buildup at each monitoring point and whether, and when, it first reaches the interference threshold.</w:t>
+        <w:t xml:space="preserve">The first table has one row per injecting well and one column per receiving well. Each cell is the pressure that the row well contributes at the column well at the evaluation time; the diagonal cells are each well's own buildup including skin. The last column gives the total felt at other wells, and the last row the total at each receiver. The second table gives the first time (years) that a single source well alone raises the pressure at each target (wells and monitoring points) by the interference threshold; a dash means it does not happen during the injection period.</w:t>
       </w:r>
     </w:p>
     <w:p>
@@ -6592,7 +7083,7 @@
           <w:sz w:val="22"/>
           <w:szCs w:val="22"/>
         </w:rPr>
-        <w:t xml:space="preserve">6.7 Compare boundaries tab</w:t>
+        <w:t xml:space="preserve">6.6 Limit check tab</w:t>
       </w:r>
     </w:p>
     <w:p>
@@ -6604,9 +7095,9 @@
       <w:r>
         <w:drawing>
           <wp:inline distT="0" distB="0" distL="0" distR="0">
-            <wp:extent cx="4972050" cy="4000500"/>
+            <wp:extent cx="5334000" cy="1838325"/>
             <wp:effectExtent t="0" r="0" b="0" l="0"/>
-            <wp:docPr id="11" name="figure" descr="Figure 11. Wellbore buildup of one well for the three boundary conditions." title="Figure 11. Wellbore buildup of one well for the three boundary conditions."/>
+            <wp:docPr id="11" name="figure" descr="Figure 10. Limit check for each well and the monitoring-point table." title="Figure 10. Limit check for each well and the monitoring-point table."/>
             <wp:cNvGraphicFramePr>
               <a:graphicFrameLocks xmlns:a="http://schemas.openxmlformats.org/drawingml/2006/main" noChangeAspect="1"/>
             </wp:cNvGraphicFramePr>
@@ -6629,7 +7120,7 @@
                   <pic:spPr bwMode="auto">
                     <a:xfrm>
                       <a:off x="0" y="0"/>
-                      <a:ext cx="4972050" cy="4000500"/>
+                      <a:ext cx="5334000" cy="1838325"/>
                     </a:xfrm>
                     <a:prstGeom prst="rect">
                       <a:avLst/>
@@ -6654,7 +7145,7 @@
           <w:sz w:val="18"/>
           <w:szCs w:val="18"/>
         </w:rPr>
-        <w:t xml:space="preserve">Figure 11. Wellbore buildup of one well for the three boundary conditions.</w:t>
+        <w:t xml:space="preserve">Figure 10. Limit check for each well and the monitoring-point table.</w:t>
       </w:r>
     </w:p>
     <w:p>
@@ -6668,38 +7159,24 @@
           <w:sz w:val="22"/>
           <w:szCs w:val="22"/>
         </w:rPr>
-        <w:t xml:space="preserve">The chart plots the buildup of the well you select for an infinite aquifer, a constant-pressure boundary and a no-flow boundary, together with the allowable buildup. The table gives the peak buildup of every well for each case; red cells exceed the limit. The no-flow case is the most conservative and the constant-pressure case the least.</w:t>
-      </w:r>
-    </w:p>
-    <w:p>
-      <w:pPr>
-        <w:pStyle w:val="Heading1"/>
+        <w:t xml:space="preserve">Each well is listed with its peak buildup, the time of the peak and how that peak splits into the well's own response, skin and interference from the other wells. The bottomhole pressure, the margin to the allowable buildup and an OK or Exceeds status follow. Below, the monitoring-point table shows the peak buildup at each monitoring point and whether, and when, it first reaches the interference threshold.</w:t>
+      </w:r>
+    </w:p>
+    <w:p>
+      <w:pPr>
+        <w:pStyle w:val="Heading2"/>
         <w:keepNext/>
-        <w:spacing w:after="100" w:before="280"/>
+        <w:spacing w:after="60" w:before="160"/>
       </w:pPr>
       <w:r>
         <w:rPr>
           <w:rFonts w:ascii="Times New Roman" w:cs="Times New Roman" w:eastAsia="Times New Roman" w:hAnsi="Times New Roman"/>
           <w:b/>
           <w:bCs/>
-          <w:sz w:val="26"/>
-          <w:szCs w:val="26"/>
-        </w:rPr>
-        <w:t xml:space="preserve">7. Working with the charts</w:t>
-      </w:r>
-    </w:p>
-    <w:p>
-      <w:pPr>
-        <w:spacing w:after="120" w:line="276"/>
-        <w:jc w:val="both"/>
-      </w:pPr>
-      <w:r>
-        <w:rPr>
-          <w:rFonts w:ascii="Times New Roman" w:cs="Times New Roman" w:eastAsia="Times New Roman" w:hAnsi="Times New Roman"/>
           <w:sz w:val="22"/>
           <w:szCs w:val="22"/>
         </w:rPr>
-        <w:t xml:space="preserve">Every chart has a title, a legend and a toolbar.</w:t>
+        <w:t xml:space="preserve">6.7 Compare boundaries tab</w:t>
       </w:r>
     </w:p>
     <w:p>
@@ -6711,9 +7188,9 @@
       <w:r>
         <w:drawing>
           <wp:inline distT="0" distB="0" distL="0" distR="0">
-            <wp:extent cx="5334000" cy="3733800"/>
+            <wp:extent cx="4972050" cy="4000500"/>
             <wp:effectExtent t="0" r="0" b="0" l="0"/>
-            <wp:docPr id="12" name="figure" descr="Figure 12. A zoomed region of a map. Zoom controls are above the chart." title="Figure 12. A zoomed region of a map. Zoom controls are above the chart."/>
+            <wp:docPr id="12" name="figure" descr="Figure 11. Wellbore buildup of one well for the three boundary conditions." title="Figure 11. Wellbore buildup of one well for the three boundary conditions."/>
             <wp:cNvGraphicFramePr>
               <a:graphicFrameLocks xmlns:a="http://schemas.openxmlformats.org/drawingml/2006/main" noChangeAspect="1"/>
             </wp:cNvGraphicFramePr>
@@ -6728,6 +7205,113 @@
                   </pic:nvPicPr>
                   <pic:blipFill>
                     <a:blip r:embed="rId19" cstate="none"/>
+                    <a:srcRect/>
+                    <a:stretch>
+                      <a:fillRect/>
+                    </a:stretch>
+                  </pic:blipFill>
+                  <pic:spPr bwMode="auto">
+                    <a:xfrm>
+                      <a:off x="0" y="0"/>
+                      <a:ext cx="4972050" cy="4000500"/>
+                    </a:xfrm>
+                    <a:prstGeom prst="rect">
+                      <a:avLst/>
+                    </a:prstGeom>
+                  </pic:spPr>
+                </pic:pic>
+              </a:graphicData>
+            </a:graphic>
+          </wp:inline>
+        </w:drawing>
+      </w:r>
+    </w:p>
+    <w:p>
+      <w:pPr>
+        <w:spacing w:after="160"/>
+      </w:pPr>
+      <w:r>
+        <w:rPr>
+          <w:rFonts w:ascii="Times New Roman" w:cs="Times New Roman" w:eastAsia="Times New Roman" w:hAnsi="Times New Roman"/>
+          <w:i/>
+          <w:iCs/>
+          <w:sz w:val="18"/>
+          <w:szCs w:val="18"/>
+        </w:rPr>
+        <w:t xml:space="preserve">Figure 11. Wellbore buildup of one well for the three boundary conditions.</w:t>
+      </w:r>
+    </w:p>
+    <w:p>
+      <w:pPr>
+        <w:spacing w:after="120" w:line="276"/>
+        <w:jc w:val="both"/>
+      </w:pPr>
+      <w:r>
+        <w:rPr>
+          <w:rFonts w:ascii="Times New Roman" w:cs="Times New Roman" w:eastAsia="Times New Roman" w:hAnsi="Times New Roman"/>
+          <w:sz w:val="22"/>
+          <w:szCs w:val="22"/>
+        </w:rPr>
+        <w:t xml:space="preserve">The chart plots the buildup of the well you select for an infinite aquifer, a constant-pressure boundary and a no-flow boundary, together with the allowable buildup. The table gives the peak buildup of every well for each case; red cells exceed the limit. The no-flow case is the most conservative and the constant-pressure case the least.</w:t>
+      </w:r>
+    </w:p>
+    <w:p>
+      <w:pPr>
+        <w:pStyle w:val="Heading1"/>
+        <w:keepNext/>
+        <w:spacing w:after="100" w:before="280"/>
+      </w:pPr>
+      <w:r>
+        <w:rPr>
+          <w:rFonts w:ascii="Times New Roman" w:cs="Times New Roman" w:eastAsia="Times New Roman" w:hAnsi="Times New Roman"/>
+          <w:b/>
+          <w:bCs/>
+          <w:sz w:val="26"/>
+          <w:szCs w:val="26"/>
+        </w:rPr>
+        <w:t xml:space="preserve">7. Working with the charts</w:t>
+      </w:r>
+    </w:p>
+    <w:p>
+      <w:pPr>
+        <w:spacing w:after="120" w:line="276"/>
+        <w:jc w:val="both"/>
+      </w:pPr>
+      <w:r>
+        <w:rPr>
+          <w:rFonts w:ascii="Times New Roman" w:cs="Times New Roman" w:eastAsia="Times New Roman" w:hAnsi="Times New Roman"/>
+          <w:sz w:val="22"/>
+          <w:szCs w:val="22"/>
+        </w:rPr>
+        <w:t xml:space="preserve">Every chart has a title, a legend and a toolbar.</w:t>
+      </w:r>
+    </w:p>
+    <w:p>
+      <w:pPr>
+        <w:keepNext/>
+        <w:spacing w:after="60" w:before="120"/>
+        <w:jc w:val="center"/>
+      </w:pPr>
+      <w:r>
+        <w:drawing>
+          <wp:inline distT="0" distB="0" distL="0" distR="0">
+            <wp:extent cx="5334000" cy="3733800"/>
+            <wp:effectExtent t="0" r="0" b="0" l="0"/>
+            <wp:docPr id="13" name="figure" descr="Figure 12. A zoomed region of a map. Zoom controls are above the chart." title="Figure 12. A zoomed region of a map. Zoom controls are above the chart."/>
+            <wp:cNvGraphicFramePr>
+              <a:graphicFrameLocks xmlns:a="http://schemas.openxmlformats.org/drawingml/2006/main" noChangeAspect="1"/>
+            </wp:cNvGraphicFramePr>
+            <a:graphic xmlns:a="http://schemas.openxmlformats.org/drawingml/2006/main">
+              <a:graphicData uri="http://schemas.openxmlformats.org/drawingml/2006/picture">
+                <pic:pic xmlns:pic="http://schemas.openxmlformats.org/drawingml/2006/picture">
+                  <pic:nvPicPr>
+                    <pic:cNvPr id="0" name="" descr=""/>
+                    <pic:cNvPicPr>
+                      <a:picLocks noChangeAspect="1" noChangeArrowheads="1"/>
+                    </pic:cNvPicPr>
+                  </pic:nvPicPr>
+                  <pic:blipFill>
+                    <a:blip r:embed="rId20" cstate="none"/>
                     <a:srcRect/>
                     <a:stretch>
                       <a:fillRect/>

</xml_diff>

<commit_message>
Contour plot style: lines coloured by value with a marked colour bar (no fill), up to 40 levels
Co-Authored-By: Claude Sonnet 5.5 <noreply@anthropic.com>
</commit_message>
<xml_diff>
--- a/public/manual/user-manual.docx
+++ b/public/manual/user-manual.docx
@@ -6528,7 +6528,7 @@
                 <w:sz w:val="18"/>
                 <w:szCs w:val="18"/>
               </w:rPr>
-              <w:t xml:space="preserve">Smooth colours, Colour bands (the pressure is grouped into the chosen number of classes with a stepped colour bar) or No fill (white map, useful with contour lines).</w:t>
+              <w:t xml:space="preserve">Smooth colours, Colour bands (the pressure is grouped into the chosen number of classes with a stepped colour bar) or No fill (white map). No fill together with Contour lines gives a classic contour plot in which every line is coloured by its pressure value and the colour bar is marked at the contour levels.</w:t>
             </w:r>
           </w:p>
         </w:tc>
@@ -6662,7 +6662,7 @@
                 <w:sz w:val="18"/>
                 <w:szCs w:val="18"/>
               </w:rPr>
-              <w:t xml:space="preserve">Draws iso-pressure lines at round values (5, 8, 10, 15 or 20 levels) with the value written on each line, only within the chosen Contour reach of the wells (Close to the wells, Around the wells, Wide, Half the map or Whole map). The levels span the pressures found inside that reach, and the colour bar is marked and labelled at the same levels, so the legend and the lines always agree. Labels turns the numbers off.</w:t>
+              <w:t xml:space="preserve">Draws iso-pressure lines at round values (5, 8, 10, 15, 20, 30 or 40 levels) with the value written on each line, only within the chosen Contour reach of the wells (Close to the wells, Around the wells, Wide, Half the map or Whole map). The levels span the pressures found inside that reach, and the colour bar is marked and labelled at the same levels, so the legend and the lines always agree. Labels turns the numbers off.</w:t>
             </w:r>
           </w:p>
         </w:tc>
@@ -6871,23 +6871,6 @@
     </w:p>
     <w:p>
       <w:pPr>
-        <w:pStyle w:val="Heading2"/>
-        <w:keepNext/>
-        <w:spacing w:after="60" w:before="160"/>
-      </w:pPr>
-      <w:r>
-        <w:rPr>
-          <w:rFonts w:ascii="Times New Roman" w:cs="Times New Roman" w:eastAsia="Times New Roman" w:hAnsi="Times New Roman"/>
-          <w:b/>
-          <w:bCs/>
-          <w:sz w:val="22"/>
-          <w:szCs w:val="22"/>
-        </w:rPr>
-        <w:t xml:space="preserve">6.4 Time series tab</w:t>
-      </w:r>
-    </w:p>
-    <w:p>
-      <w:pPr>
         <w:keepNext/>
         <w:spacing w:after="60" w:before="120"/>
         <w:jc w:val="center"/>
@@ -6895,9 +6878,9 @@
       <w:r>
         <w:drawing>
           <wp:inline distT="0" distB="0" distL="0" distR="0">
-            <wp:extent cx="5334000" cy="2943225"/>
+            <wp:extent cx="4857750" cy="4000500"/>
             <wp:effectExtent t="0" r="0" b="0" l="0"/>
-            <wp:docPr id="9" name="figure" descr="Figure 8. Time series of pressure at every well and monitoring point, with the field maximum and average." title="Figure 8. Time series of pressure at every well and monitoring point, with the field maximum and average."/>
+            <wp:docPr id="9" name="figure" descr="Figure 7b. A contour plot (No fill, Jet scale, 15 levels, whole map): each line is coloured by its pressure value." title="Figure 7b. A contour plot (No fill, Jet scale, 15 levels, whole map): each line is coloured by its pressure value."/>
             <wp:cNvGraphicFramePr>
               <a:graphicFrameLocks xmlns:a="http://schemas.openxmlformats.org/drawingml/2006/main" noChangeAspect="1"/>
             </wp:cNvGraphicFramePr>
@@ -6920,7 +6903,7 @@
                   <pic:spPr bwMode="auto">
                     <a:xfrm>
                       <a:off x="0" y="0"/>
-                      <a:ext cx="5334000" cy="2943225"/>
+                      <a:ext cx="4857750" cy="4000500"/>
                     </a:xfrm>
                     <a:prstGeom prst="rect">
                       <a:avLst/>
@@ -6945,35 +6928,7 @@
           <w:sz w:val="18"/>
           <w:szCs w:val="18"/>
         </w:rPr>
-        <w:t xml:space="preserve">Figure 8. Time series of pressure at every well and monitoring point, with the field maximum and average.</w:t>
-      </w:r>
-    </w:p>
-    <w:p>
-      <w:pPr>
-        <w:spacing w:after="120" w:line="276"/>
-        <w:jc w:val="both"/>
-      </w:pPr>
-      <w:r>
-        <w:rPr>
-          <w:rFonts w:ascii="Times New Roman" w:cs="Times New Roman" w:eastAsia="Times New Roman" w:hAnsi="Times New Roman"/>
-          <w:sz w:val="22"/>
-          <w:szCs w:val="22"/>
-        </w:rPr>
-        <w:t xml:space="preserve">The Show selector chooses what is plotted: total buildup (ΔP) at each wellbore including skin; bottomhole pressure (initial pressure plus buildup), with the maximum allowable bottomhole pressure; or interference only, which removes each well's own contribution so that only the effect of the other wells remains. Dashed lines are monitoring points. The black line is the field maximum (the highest pressure of any well at each time) and the grey dash-dot line is the field average.</w:t>
-      </w:r>
-    </w:p>
-    <w:p>
-      <w:pPr>
-        <w:spacing w:after="120" w:line="276"/>
-        <w:jc w:val="both"/>
-      </w:pPr>
-      <w:r>
-        <w:rPr>
-          <w:rFonts w:ascii="Times New Roman" w:cs="Times New Roman" w:eastAsia="Times New Roman" w:hAnsi="Times New Roman"/>
-          <w:sz w:val="22"/>
-          <w:szCs w:val="22"/>
-        </w:rPr>
-        <w:t xml:space="preserve">Under the chart, the section “What drives the field maximum” stacks the contributions of each injector and of skin at the well that has the highest pressure at each time, and a table gives the breakdown at the moment of the field peak.</w:t>
+        <w:t xml:space="preserve">Figure 7b. A contour plot (No fill, Jet scale, 15 levels, whole map): each line is coloured by its pressure value.</w:t>
       </w:r>
     </w:p>
     <w:p>
@@ -6990,7 +6945,7 @@
           <w:sz w:val="22"/>
           <w:szCs w:val="22"/>
         </w:rPr>
-        <w:t xml:space="preserve">6.5 Interference matrix tab</w:t>
+        <w:t xml:space="preserve">6.4 Time series tab</w:t>
       </w:r>
     </w:p>
     <w:p>
@@ -7002,9 +6957,9 @@
       <w:r>
         <w:drawing>
           <wp:inline distT="0" distB="0" distL="0" distR="0">
-            <wp:extent cx="5334000" cy="2667000"/>
+            <wp:extent cx="5334000" cy="2943225"/>
             <wp:effectExtent t="0" r="0" b="0" l="0"/>
-            <wp:docPr id="10" name="figure" descr="Figure 9. Interference matrix and arrival-time table." title="Figure 9. Interference matrix and arrival-time table."/>
+            <wp:docPr id="10" name="figure" descr="Figure 8. Time series of pressure at every well and monitoring point, with the field maximum and average." title="Figure 8. Time series of pressure at every well and monitoring point, with the field maximum and average."/>
             <wp:cNvGraphicFramePr>
               <a:graphicFrameLocks xmlns:a="http://schemas.openxmlformats.org/drawingml/2006/main" noChangeAspect="1"/>
             </wp:cNvGraphicFramePr>
@@ -7027,7 +6982,7 @@
                   <pic:spPr bwMode="auto">
                     <a:xfrm>
                       <a:off x="0" y="0"/>
-                      <a:ext cx="5334000" cy="2667000"/>
+                      <a:ext cx="5334000" cy="2943225"/>
                     </a:xfrm>
                     <a:prstGeom prst="rect">
                       <a:avLst/>
@@ -7052,7 +7007,7 @@
           <w:sz w:val="18"/>
           <w:szCs w:val="18"/>
         </w:rPr>
-        <w:t xml:space="preserve">Figure 9. Interference matrix and arrival-time table.</w:t>
+        <w:t xml:space="preserve">Figure 8. Time series of pressure at every well and monitoring point, with the field maximum and average.</w:t>
       </w:r>
     </w:p>
     <w:p>
@@ -7066,7 +7021,21 @@
           <w:sz w:val="22"/>
           <w:szCs w:val="22"/>
         </w:rPr>
-        <w:t xml:space="preserve">The first table has one row per injecting well and one column per receiving well. Each cell is the pressure that the row well contributes at the column well at the evaluation time; the diagonal cells are each well's own buildup including skin. The last column gives the total felt at other wells, and the last row the total at each receiver. The second table gives the first time (years) that a single source well alone raises the pressure at each target (wells and monitoring points) by the interference threshold; a dash means it does not happen during the injection period.</w:t>
+        <w:t xml:space="preserve">The Show selector chooses what is plotted: total buildup (ΔP) at each wellbore including skin; bottomhole pressure (initial pressure plus buildup), with the maximum allowable bottomhole pressure; or interference only, which removes each well's own contribution so that only the effect of the other wells remains. Dashed lines are monitoring points. The black line is the field maximum (the highest pressure of any well at each time) and the grey dash-dot line is the field average.</w:t>
+      </w:r>
+    </w:p>
+    <w:p>
+      <w:pPr>
+        <w:spacing w:after="120" w:line="276"/>
+        <w:jc w:val="both"/>
+      </w:pPr>
+      <w:r>
+        <w:rPr>
+          <w:rFonts w:ascii="Times New Roman" w:cs="Times New Roman" w:eastAsia="Times New Roman" w:hAnsi="Times New Roman"/>
+          <w:sz w:val="22"/>
+          <w:szCs w:val="22"/>
+        </w:rPr>
+        <w:t xml:space="preserve">Under the chart, the section “What drives the field maximum” stacks the contributions of each injector and of skin at the well that has the highest pressure at each time, and a table gives the breakdown at the moment of the field peak.</w:t>
       </w:r>
     </w:p>
     <w:p>
@@ -7083,7 +7052,7 @@
           <w:sz w:val="22"/>
           <w:szCs w:val="22"/>
         </w:rPr>
-        <w:t xml:space="preserve">6.6 Limit check tab</w:t>
+        <w:t xml:space="preserve">6.5 Interference matrix tab</w:t>
       </w:r>
     </w:p>
     <w:p>
@@ -7095,9 +7064,9 @@
       <w:r>
         <w:drawing>
           <wp:inline distT="0" distB="0" distL="0" distR="0">
-            <wp:extent cx="5334000" cy="1838325"/>
+            <wp:extent cx="5334000" cy="2667000"/>
             <wp:effectExtent t="0" r="0" b="0" l="0"/>
-            <wp:docPr id="11" name="figure" descr="Figure 10. Limit check for each well and the monitoring-point table." title="Figure 10. Limit check for each well and the monitoring-point table."/>
+            <wp:docPr id="11" name="figure" descr="Figure 9. Interference matrix and arrival-time table." title="Figure 9. Interference matrix and arrival-time table."/>
             <wp:cNvGraphicFramePr>
               <a:graphicFrameLocks xmlns:a="http://schemas.openxmlformats.org/drawingml/2006/main" noChangeAspect="1"/>
             </wp:cNvGraphicFramePr>
@@ -7120,7 +7089,7 @@
                   <pic:spPr bwMode="auto">
                     <a:xfrm>
                       <a:off x="0" y="0"/>
-                      <a:ext cx="5334000" cy="1838325"/>
+                      <a:ext cx="5334000" cy="2667000"/>
                     </a:xfrm>
                     <a:prstGeom prst="rect">
                       <a:avLst/>
@@ -7145,7 +7114,7 @@
           <w:sz w:val="18"/>
           <w:szCs w:val="18"/>
         </w:rPr>
-        <w:t xml:space="preserve">Figure 10. Limit check for each well and the monitoring-point table.</w:t>
+        <w:t xml:space="preserve">Figure 9. Interference matrix and arrival-time table.</w:t>
       </w:r>
     </w:p>
     <w:p>
@@ -7159,7 +7128,7 @@
           <w:sz w:val="22"/>
           <w:szCs w:val="22"/>
         </w:rPr>
-        <w:t xml:space="preserve">Each well is listed with its peak buildup, the time of the peak and how that peak splits into the well's own response, skin and interference from the other wells. The bottomhole pressure, the margin to the allowable buildup and an OK or Exceeds status follow. Below, the monitoring-point table shows the peak buildup at each monitoring point and whether, and when, it first reaches the interference threshold.</w:t>
+        <w:t xml:space="preserve">The first table has one row per injecting well and one column per receiving well. Each cell is the pressure that the row well contributes at the column well at the evaluation time; the diagonal cells are each well's own buildup including skin. The last column gives the total felt at other wells, and the last row the total at each receiver. The second table gives the first time (years) that a single source well alone raises the pressure at each target (wells and monitoring points) by the interference threshold; a dash means it does not happen during the injection period.</w:t>
       </w:r>
     </w:p>
     <w:p>
@@ -7176,7 +7145,7 @@
           <w:sz w:val="22"/>
           <w:szCs w:val="22"/>
         </w:rPr>
-        <w:t xml:space="preserve">6.7 Compare boundaries tab</w:t>
+        <w:t xml:space="preserve">6.6 Limit check tab</w:t>
       </w:r>
     </w:p>
     <w:p>
@@ -7188,9 +7157,9 @@
       <w:r>
         <w:drawing>
           <wp:inline distT="0" distB="0" distL="0" distR="0">
-            <wp:extent cx="4972050" cy="4000500"/>
+            <wp:extent cx="5334000" cy="1838325"/>
             <wp:effectExtent t="0" r="0" b="0" l="0"/>
-            <wp:docPr id="12" name="figure" descr="Figure 11. Wellbore buildup of one well for the three boundary conditions." title="Figure 11. Wellbore buildup of one well for the three boundary conditions."/>
+            <wp:docPr id="12" name="figure" descr="Figure 10. Limit check for each well and the monitoring-point table." title="Figure 10. Limit check for each well and the monitoring-point table."/>
             <wp:cNvGraphicFramePr>
               <a:graphicFrameLocks xmlns:a="http://schemas.openxmlformats.org/drawingml/2006/main" noChangeAspect="1"/>
             </wp:cNvGraphicFramePr>
@@ -7213,7 +7182,7 @@
                   <pic:spPr bwMode="auto">
                     <a:xfrm>
                       <a:off x="0" y="0"/>
-                      <a:ext cx="4972050" cy="4000500"/>
+                      <a:ext cx="5334000" cy="1838325"/>
                     </a:xfrm>
                     <a:prstGeom prst="rect">
                       <a:avLst/>
@@ -7238,7 +7207,7 @@
           <w:sz w:val="18"/>
           <w:szCs w:val="18"/>
         </w:rPr>
-        <w:t xml:space="preserve">Figure 11. Wellbore buildup of one well for the three boundary conditions.</w:t>
+        <w:t xml:space="preserve">Figure 10. Limit check for each well and the monitoring-point table.</w:t>
       </w:r>
     </w:p>
     <w:p>
@@ -7252,38 +7221,24 @@
           <w:sz w:val="22"/>
           <w:szCs w:val="22"/>
         </w:rPr>
-        <w:t xml:space="preserve">The chart plots the buildup of the well you select for an infinite aquifer, a constant-pressure boundary and a no-flow boundary, together with the allowable buildup. The table gives the peak buildup of every well for each case; red cells exceed the limit. The no-flow case is the most conservative and the constant-pressure case the least.</w:t>
-      </w:r>
-    </w:p>
-    <w:p>
-      <w:pPr>
-        <w:pStyle w:val="Heading1"/>
+        <w:t xml:space="preserve">Each well is listed with its peak buildup, the time of the peak and how that peak splits into the well's own response, skin and interference from the other wells. The bottomhole pressure, the margin to the allowable buildup and an OK or Exceeds status follow. Below, the monitoring-point table shows the peak buildup at each monitoring point and whether, and when, it first reaches the interference threshold.</w:t>
+      </w:r>
+    </w:p>
+    <w:p>
+      <w:pPr>
+        <w:pStyle w:val="Heading2"/>
         <w:keepNext/>
-        <w:spacing w:after="100" w:before="280"/>
+        <w:spacing w:after="60" w:before="160"/>
       </w:pPr>
       <w:r>
         <w:rPr>
           <w:rFonts w:ascii="Times New Roman" w:cs="Times New Roman" w:eastAsia="Times New Roman" w:hAnsi="Times New Roman"/>
           <w:b/>
           <w:bCs/>
-          <w:sz w:val="26"/>
-          <w:szCs w:val="26"/>
-        </w:rPr>
-        <w:t xml:space="preserve">7. Working with the charts</w:t>
-      </w:r>
-    </w:p>
-    <w:p>
-      <w:pPr>
-        <w:spacing w:after="120" w:line="276"/>
-        <w:jc w:val="both"/>
-      </w:pPr>
-      <w:r>
-        <w:rPr>
-          <w:rFonts w:ascii="Times New Roman" w:cs="Times New Roman" w:eastAsia="Times New Roman" w:hAnsi="Times New Roman"/>
           <w:sz w:val="22"/>
           <w:szCs w:val="22"/>
         </w:rPr>
-        <w:t xml:space="preserve">Every chart has a title, a legend and a toolbar.</w:t>
+        <w:t xml:space="preserve">6.7 Compare boundaries tab</w:t>
       </w:r>
     </w:p>
     <w:p>
@@ -7295,9 +7250,9 @@
       <w:r>
         <w:drawing>
           <wp:inline distT="0" distB="0" distL="0" distR="0">
-            <wp:extent cx="5334000" cy="3733800"/>
+            <wp:extent cx="4972050" cy="4000500"/>
             <wp:effectExtent t="0" r="0" b="0" l="0"/>
-            <wp:docPr id="13" name="figure" descr="Figure 12. A zoomed region of a map. Zoom controls are above the chart." title="Figure 12. A zoomed region of a map. Zoom controls are above the chart."/>
+            <wp:docPr id="13" name="figure" descr="Figure 11. Wellbore buildup of one well for the three boundary conditions." title="Figure 11. Wellbore buildup of one well for the three boundary conditions."/>
             <wp:cNvGraphicFramePr>
               <a:graphicFrameLocks xmlns:a="http://schemas.openxmlformats.org/drawingml/2006/main" noChangeAspect="1"/>
             </wp:cNvGraphicFramePr>
@@ -7312,6 +7267,113 @@
                   </pic:nvPicPr>
                   <pic:blipFill>
                     <a:blip r:embed="rId20" cstate="none"/>
+                    <a:srcRect/>
+                    <a:stretch>
+                      <a:fillRect/>
+                    </a:stretch>
+                  </pic:blipFill>
+                  <pic:spPr bwMode="auto">
+                    <a:xfrm>
+                      <a:off x="0" y="0"/>
+                      <a:ext cx="4972050" cy="4000500"/>
+                    </a:xfrm>
+                    <a:prstGeom prst="rect">
+                      <a:avLst/>
+                    </a:prstGeom>
+                  </pic:spPr>
+                </pic:pic>
+              </a:graphicData>
+            </a:graphic>
+          </wp:inline>
+        </w:drawing>
+      </w:r>
+    </w:p>
+    <w:p>
+      <w:pPr>
+        <w:spacing w:after="160"/>
+      </w:pPr>
+      <w:r>
+        <w:rPr>
+          <w:rFonts w:ascii="Times New Roman" w:cs="Times New Roman" w:eastAsia="Times New Roman" w:hAnsi="Times New Roman"/>
+          <w:i/>
+          <w:iCs/>
+          <w:sz w:val="18"/>
+          <w:szCs w:val="18"/>
+        </w:rPr>
+        <w:t xml:space="preserve">Figure 11. Wellbore buildup of one well for the three boundary conditions.</w:t>
+      </w:r>
+    </w:p>
+    <w:p>
+      <w:pPr>
+        <w:spacing w:after="120" w:line="276"/>
+        <w:jc w:val="both"/>
+      </w:pPr>
+      <w:r>
+        <w:rPr>
+          <w:rFonts w:ascii="Times New Roman" w:cs="Times New Roman" w:eastAsia="Times New Roman" w:hAnsi="Times New Roman"/>
+          <w:sz w:val="22"/>
+          <w:szCs w:val="22"/>
+        </w:rPr>
+        <w:t xml:space="preserve">The chart plots the buildup of the well you select for an infinite aquifer, a constant-pressure boundary and a no-flow boundary, together with the allowable buildup. The table gives the peak buildup of every well for each case; red cells exceed the limit. The no-flow case is the most conservative and the constant-pressure case the least.</w:t>
+      </w:r>
+    </w:p>
+    <w:p>
+      <w:pPr>
+        <w:pStyle w:val="Heading1"/>
+        <w:keepNext/>
+        <w:spacing w:after="100" w:before="280"/>
+      </w:pPr>
+      <w:r>
+        <w:rPr>
+          <w:rFonts w:ascii="Times New Roman" w:cs="Times New Roman" w:eastAsia="Times New Roman" w:hAnsi="Times New Roman"/>
+          <w:b/>
+          <w:bCs/>
+          <w:sz w:val="26"/>
+          <w:szCs w:val="26"/>
+        </w:rPr>
+        <w:t xml:space="preserve">7. Working with the charts</w:t>
+      </w:r>
+    </w:p>
+    <w:p>
+      <w:pPr>
+        <w:spacing w:after="120" w:line="276"/>
+        <w:jc w:val="both"/>
+      </w:pPr>
+      <w:r>
+        <w:rPr>
+          <w:rFonts w:ascii="Times New Roman" w:cs="Times New Roman" w:eastAsia="Times New Roman" w:hAnsi="Times New Roman"/>
+          <w:sz w:val="22"/>
+          <w:szCs w:val="22"/>
+        </w:rPr>
+        <w:t xml:space="preserve">Every chart has a title, a legend and a toolbar.</w:t>
+      </w:r>
+    </w:p>
+    <w:p>
+      <w:pPr>
+        <w:keepNext/>
+        <w:spacing w:after="60" w:before="120"/>
+        <w:jc w:val="center"/>
+      </w:pPr>
+      <w:r>
+        <w:drawing>
+          <wp:inline distT="0" distB="0" distL="0" distR="0">
+            <wp:extent cx="5334000" cy="3733800"/>
+            <wp:effectExtent t="0" r="0" b="0" l="0"/>
+            <wp:docPr id="14" name="figure" descr="Figure 12. A zoomed region of a map. Zoom controls are above the chart." title="Figure 12. A zoomed region of a map. Zoom controls are above the chart."/>
+            <wp:cNvGraphicFramePr>
+              <a:graphicFrameLocks xmlns:a="http://schemas.openxmlformats.org/drawingml/2006/main" noChangeAspect="1"/>
+            </wp:cNvGraphicFramePr>
+            <a:graphic xmlns:a="http://schemas.openxmlformats.org/drawingml/2006/main">
+              <a:graphicData uri="http://schemas.openxmlformats.org/drawingml/2006/picture">
+                <pic:pic xmlns:pic="http://schemas.openxmlformats.org/drawingml/2006/picture">
+                  <pic:nvPicPr>
+                    <pic:cNvPr id="0" name="" descr=""/>
+                    <pic:cNvPicPr>
+                      <a:picLocks noChangeAspect="1" noChangeArrowheads="1"/>
+                    </pic:cNvPicPr>
+                  </pic:nvPicPr>
+                  <pic:blipFill>
+                    <a:blip r:embed="rId21" cstate="none"/>
                     <a:srcRect/>
                     <a:stretch>
                       <a:fillRect/>

</xml_diff>

<commit_message>
Contours drawn around each well from that well's own pressure change; common levels and legend
Co-Authored-By: Claude Sonnet 5.5 <noreply@anthropic.com>
</commit_message>
<xml_diff>
--- a/public/manual/user-manual.docx
+++ b/public/manual/user-manual.docx
@@ -6662,7 +6662,7 @@
                 <w:sz w:val="18"/>
                 <w:szCs w:val="18"/>
               </w:rPr>
-              <w:t xml:space="preserve">Draws iso-pressure lines at round values (5, 8, 10, 15, 20, 30 or 40 levels) with the value written on each line, only within the chosen Contour reach of the wells (Close to the wells, Around the wells, Wide, Half the map or Whole map). The levels span the pressures found inside that reach, and the colour bar is marked and labelled at the same levels, so the legend and the lines always agree. Labels turns the numbers off.</w:t>
+              <w:t xml:space="preserve">Draws iso-pressure lines at round values (5, 8, 10, 15, 20, 30 or 40 levels) with the value written on each line. Contours of: Each well separately (default) draws, around every well, the lines of the pressure change caused by that well alone, so you see how the pressure of each well propagates; Total field draws the lines of the summed field. The lines stay within the chosen Contour reach of the well (Close to the wells, Around the wells, Wide, Half the map or Whole map). The levels are common to all wells and span the pressures found inside the reach, and the colour bar is marked and labelled at the same levels, so the legend and the lines always agree. Labels turns the numbers off.</w:t>
             </w:r>
           </w:p>
         </w:tc>
@@ -6816,7 +6816,7 @@
       <w:r>
         <w:drawing>
           <wp:inline distT="0" distB="0" distL="0" distR="0">
-            <wp:extent cx="4857750" cy="4000500"/>
+            <wp:extent cx="4762500" cy="4000500"/>
             <wp:effectExtent t="0" r="0" b="0" l="0"/>
             <wp:docPr id="8" name="figure" descr="Figure 7a. The pressure map with the Viridis scale, colour bands, contour lines and streamlines." title="Figure 7a. The pressure map with the Viridis scale, colour bands, contour lines and streamlines."/>
             <wp:cNvGraphicFramePr>
@@ -6841,7 +6841,7 @@
                   <pic:spPr bwMode="auto">
                     <a:xfrm>
                       <a:off x="0" y="0"/>
-                      <a:ext cx="4857750" cy="4000500"/>
+                      <a:ext cx="4762500" cy="4000500"/>
                     </a:xfrm>
                     <a:prstGeom prst="rect">
                       <a:avLst/>
@@ -6880,7 +6880,7 @@
           <wp:inline distT="0" distB="0" distL="0" distR="0">
             <wp:extent cx="4857750" cy="4000500"/>
             <wp:effectExtent t="0" r="0" b="0" l="0"/>
-            <wp:docPr id="9" name="figure" descr="Figure 7b. A contour plot (No fill, Jet scale, 15 levels, whole map): each line is coloured by its pressure value." title="Figure 7b. A contour plot (No fill, Jet scale, 15 levels, whole map): each line is coloured by its pressure value."/>
+            <wp:docPr id="9" name="figure" descr="Figure 7b. A contour plot (No fill, Jet scale, 15 levels): the lines around each well show how the pressure of that well alone propagates, coloured by pressure value." title="Figure 7b. A contour plot (No fill, Jet scale, 15 levels): the lines around each well show how the pressure of that well alone propagates, coloured by pressure value."/>
             <wp:cNvGraphicFramePr>
               <a:graphicFrameLocks xmlns:a="http://schemas.openxmlformats.org/drawingml/2006/main" noChangeAspect="1"/>
             </wp:cNvGraphicFramePr>
@@ -6928,7 +6928,7 @@
           <w:sz w:val="18"/>
           <w:szCs w:val="18"/>
         </w:rPr>
-        <w:t xml:space="preserve">Figure 7b. A contour plot (No fill, Jet scale, 15 levels, whole map): each line is coloured by its pressure value.</w:t>
+        <w:t xml:space="preserve">Figure 7b. A contour plot (No fill, Jet scale, 15 levels): the lines around each well show how the pressure of that well alone propagates, coloured by pressure value.</w:t>
       </w:r>
     </w:p>
     <w:p>

</xml_diff>